<commit_message>
Bot Terminado - preview v2.0
</commit_message>
<xml_diff>
--- a/docs/03. PlanDePruebas_B01_ConsultaJudicial_v1.docx
+++ b/docs/03. PlanDePruebas_B01_ConsultaJudicial_v1.docx
@@ -124,12 +124,6 @@
         <w:gridCol w:w="7387"/>
       </w:tblGrid>
       <w:tr>
-        <w:tblPrEx>
-          <w:tblCellMar>
-            <w:top w:w="0" w:type="dxa"/>
-            <w:bottom w:w="0" w:type="dxa"/>
-          </w:tblCellMar>
-        </w:tblPrEx>
         <w:tc>
           <w:tcPr>
             <w:tcW w:w="1335" w:type="pct"/>
@@ -200,12 +194,6 @@
         </w:tc>
       </w:tr>
       <w:tr>
-        <w:tblPrEx>
-          <w:tblCellMar>
-            <w:top w:w="0" w:type="dxa"/>
-            <w:bottom w:w="0" w:type="dxa"/>
-          </w:tblCellMar>
-        </w:tblPrEx>
         <w:tc>
           <w:tcPr>
             <w:tcW w:w="1335" w:type="pct"/>
@@ -266,12 +254,6 @@
         </w:tc>
       </w:tr>
       <w:tr>
-        <w:tblPrEx>
-          <w:tblCellMar>
-            <w:top w:w="0" w:type="dxa"/>
-            <w:bottom w:w="0" w:type="dxa"/>
-          </w:tblCellMar>
-        </w:tblPrEx>
         <w:tc>
           <w:tcPr>
             <w:tcW w:w="1335" w:type="pct"/>
@@ -332,12 +314,6 @@
         </w:tc>
       </w:tr>
       <w:tr>
-        <w:tblPrEx>
-          <w:tblCellMar>
-            <w:top w:w="0" w:type="dxa"/>
-            <w:bottom w:w="0" w:type="dxa"/>
-          </w:tblCellMar>
-        </w:tblPrEx>
         <w:tc>
           <w:tcPr>
             <w:tcW w:w="1335" w:type="pct"/>
@@ -398,12 +374,6 @@
         </w:tc>
       </w:tr>
       <w:tr>
-        <w:tblPrEx>
-          <w:tblCellMar>
-            <w:top w:w="0" w:type="dxa"/>
-            <w:bottom w:w="0" w:type="dxa"/>
-          </w:tblCellMar>
-        </w:tblPrEx>
         <w:tc>
           <w:tcPr>
             <w:tcW w:w="1335" w:type="pct"/>
@@ -464,12 +434,6 @@
         </w:tc>
       </w:tr>
       <w:tr>
-        <w:tblPrEx>
-          <w:tblCellMar>
-            <w:top w:w="0" w:type="dxa"/>
-            <w:bottom w:w="0" w:type="dxa"/>
-          </w:tblCellMar>
-        </w:tblPrEx>
         <w:tc>
           <w:tcPr>
             <w:tcW w:w="1335" w:type="pct"/>
@@ -530,12 +494,6 @@
         </w:tc>
       </w:tr>
       <w:tr>
-        <w:tblPrEx>
-          <w:tblCellMar>
-            <w:top w:w="0" w:type="dxa"/>
-            <w:bottom w:w="0" w:type="dxa"/>
-          </w:tblCellMar>
-        </w:tblPrEx>
         <w:tc>
           <w:tcPr>
             <w:tcW w:w="1335" w:type="pct"/>
@@ -614,12 +572,6 @@
         </w:tc>
       </w:tr>
       <w:tr>
-        <w:tblPrEx>
-          <w:tblCellMar>
-            <w:top w:w="0" w:type="dxa"/>
-            <w:bottom w:w="0" w:type="dxa"/>
-          </w:tblCellMar>
-        </w:tblPrEx>
         <w:tc>
           <w:tcPr>
             <w:tcW w:w="1335" w:type="pct"/>
@@ -680,12 +632,6 @@
         </w:tc>
       </w:tr>
       <w:tr>
-        <w:tblPrEx>
-          <w:tblCellMar>
-            <w:top w:w="0" w:type="dxa"/>
-            <w:bottom w:w="0" w:type="dxa"/>
-          </w:tblCellMar>
-        </w:tblPrEx>
         <w:tc>
           <w:tcPr>
             <w:tcW w:w="1335" w:type="pct"/>
@@ -746,12 +692,6 @@
         </w:tc>
       </w:tr>
       <w:tr>
-        <w:tblPrEx>
-          <w:tblCellMar>
-            <w:top w:w="0" w:type="dxa"/>
-            <w:bottom w:w="0" w:type="dxa"/>
-          </w:tblCellMar>
-        </w:tblPrEx>
         <w:tc>
           <w:tcPr>
             <w:tcW w:w="1335" w:type="pct"/>
@@ -812,12 +752,6 @@
         </w:tc>
       </w:tr>
       <w:tr>
-        <w:tblPrEx>
-          <w:tblCellMar>
-            <w:top w:w="0" w:type="dxa"/>
-            <w:bottom w:w="0" w:type="dxa"/>
-          </w:tblCellMar>
-        </w:tblPrEx>
         <w:tc>
           <w:tcPr>
             <w:tcW w:w="1335" w:type="pct"/>
@@ -917,12 +851,6 @@
         <w:gridCol w:w="3296"/>
       </w:tblGrid>
       <w:tr>
-        <w:tblPrEx>
-          <w:tblCellMar>
-            <w:top w:w="0" w:type="dxa"/>
-            <w:bottom w:w="0" w:type="dxa"/>
-          </w:tblCellMar>
-        </w:tblPrEx>
         <w:tc>
           <w:tcPr>
             <w:tcW w:w="747" w:type="pct"/>
@@ -1095,12 +1023,6 @@
         </w:tc>
       </w:tr>
       <w:tr>
-        <w:tblPrEx>
-          <w:tblCellMar>
-            <w:top w:w="0" w:type="dxa"/>
-            <w:bottom w:w="0" w:type="dxa"/>
-          </w:tblCellMar>
-        </w:tblPrEx>
         <w:tc>
           <w:tcPr>
             <w:tcW w:w="747" w:type="pct"/>
@@ -1298,12 +1220,6 @@
         <w:gridCol w:w="1960"/>
       </w:tblGrid>
       <w:tr>
-        <w:tblPrEx>
-          <w:tblCellMar>
-            <w:top w:w="0" w:type="dxa"/>
-            <w:bottom w:w="0" w:type="dxa"/>
-          </w:tblCellMar>
-        </w:tblPrEx>
         <w:tc>
           <w:tcPr>
             <w:tcW w:w="887" w:type="dxa"/>
@@ -1510,12 +1426,6 @@
         </w:tc>
       </w:tr>
       <w:tr>
-        <w:tblPrEx>
-          <w:tblCellMar>
-            <w:top w:w="0" w:type="dxa"/>
-            <w:bottom w:w="0" w:type="dxa"/>
-          </w:tblCellMar>
-        </w:tblPrEx>
         <w:tc>
           <w:tcPr>
             <w:tcW w:w="887" w:type="dxa"/>
@@ -1687,12 +1597,6 @@
         </w:tc>
       </w:tr>
       <w:tr>
-        <w:tblPrEx>
-          <w:tblCellMar>
-            <w:top w:w="0" w:type="dxa"/>
-            <w:bottom w:w="0" w:type="dxa"/>
-          </w:tblCellMar>
-        </w:tblPrEx>
         <w:tc>
           <w:tcPr>
             <w:tcW w:w="887" w:type="dxa"/>
@@ -1891,12 +1795,6 @@
         <w:gridCol w:w="5040"/>
       </w:tblGrid>
       <w:tr>
-        <w:tblPrEx>
-          <w:tblCellMar>
-            <w:top w:w="0" w:type="dxa"/>
-            <w:bottom w:w="0" w:type="dxa"/>
-          </w:tblCellMar>
-        </w:tblPrEx>
         <w:tc>
           <w:tcPr>
             <w:tcW w:w="5129" w:type="dxa"/>
@@ -2374,12 +2272,6 @@
         <w:gridCol w:w="3933"/>
       </w:tblGrid>
       <w:tr>
-        <w:tblPrEx>
-          <w:tblCellMar>
-            <w:top w:w="0" w:type="dxa"/>
-            <w:bottom w:w="0" w:type="dxa"/>
-          </w:tblCellMar>
-        </w:tblPrEx>
         <w:tc>
           <w:tcPr>
             <w:tcW w:w="900" w:type="dxa"/>
@@ -2518,12 +2410,6 @@
         </w:tc>
       </w:tr>
       <w:tr>
-        <w:tblPrEx>
-          <w:tblCellMar>
-            <w:top w:w="0" w:type="dxa"/>
-            <w:bottom w:w="0" w:type="dxa"/>
-          </w:tblCellMar>
-        </w:tblPrEx>
         <w:tc>
           <w:tcPr>
             <w:tcW w:w="900" w:type="dxa"/>
@@ -2674,12 +2560,6 @@
         </w:tc>
       </w:tr>
       <w:tr>
-        <w:tblPrEx>
-          <w:tblCellMar>
-            <w:top w:w="0" w:type="dxa"/>
-            <w:bottom w:w="0" w:type="dxa"/>
-          </w:tblCellMar>
-        </w:tblPrEx>
         <w:tc>
           <w:tcPr>
             <w:tcW w:w="900" w:type="dxa"/>
@@ -2794,12 +2674,6 @@
         </w:tc>
       </w:tr>
       <w:tr>
-        <w:tblPrEx>
-          <w:tblCellMar>
-            <w:top w:w="0" w:type="dxa"/>
-            <w:bottom w:w="0" w:type="dxa"/>
-          </w:tblCellMar>
-        </w:tblPrEx>
         <w:tc>
           <w:tcPr>
             <w:tcW w:w="900" w:type="dxa"/>
@@ -2946,12 +2820,6 @@
         <w:gridCol w:w="1979"/>
       </w:tblGrid>
       <w:tr>
-        <w:tblPrEx>
-          <w:tblCellMar>
-            <w:top w:w="0" w:type="dxa"/>
-            <w:bottom w:w="0" w:type="dxa"/>
-          </w:tblCellMar>
-        </w:tblPrEx>
         <w:tc>
           <w:tcPr>
             <w:tcW w:w="2200" w:type="dxa"/>
@@ -3090,12 +2958,6 @@
         </w:tc>
       </w:tr>
       <w:tr>
-        <w:tblPrEx>
-          <w:tblCellMar>
-            <w:top w:w="0" w:type="dxa"/>
-            <w:bottom w:w="0" w:type="dxa"/>
-          </w:tblCellMar>
-        </w:tblPrEx>
         <w:tc>
           <w:tcPr>
             <w:tcW w:w="2200" w:type="dxa"/>
@@ -3210,12 +3072,6 @@
         </w:tc>
       </w:tr>
       <w:tr>
-        <w:tblPrEx>
-          <w:tblCellMar>
-            <w:top w:w="0" w:type="dxa"/>
-            <w:bottom w:w="0" w:type="dxa"/>
-          </w:tblCellMar>
-        </w:tblPrEx>
         <w:tc>
           <w:tcPr>
             <w:tcW w:w="2200" w:type="dxa"/>
@@ -3624,13 +3480,7 @@
         <w:rPr>
           <w:color w:val="404040"/>
         </w:rPr>
-        <w:t xml:space="preserve"> en variables</w:t>
-      </w:r>
-      <w:r>
-        <w:rPr>
-          <w:color w:val="404040"/>
-        </w:rPr>
-        <w:t xml:space="preserve">, manejar </w:t>
+        <w:t xml:space="preserve"> en variables, manejar </w:t>
       </w:r>
       <w:proofErr w:type="spellStart"/>
       <w:r>
@@ -3644,13 +3494,7 @@
         <w:rPr>
           <w:color w:val="404040"/>
         </w:rPr>
-        <w:t xml:space="preserve"> Manager</w:t>
-      </w:r>
-      <w:r>
-        <w:rPr>
-          <w:color w:val="404040"/>
-        </w:rPr>
-        <w:t xml:space="preserve"> y Base de datos</w:t>
+        <w:t xml:space="preserve"> Manager y Base de datos</w:t>
       </w:r>
     </w:p>
     <w:p>
@@ -3908,12 +3752,6 @@
         <w:gridCol w:w="6960"/>
       </w:tblGrid>
       <w:tr>
-        <w:tblPrEx>
-          <w:tblCellMar>
-            <w:top w:w="0" w:type="dxa"/>
-            <w:bottom w:w="0" w:type="dxa"/>
-          </w:tblCellMar>
-        </w:tblPrEx>
         <w:tc>
           <w:tcPr>
             <w:tcW w:w="2400" w:type="dxa"/>
@@ -3984,12 +3822,6 @@
         </w:tc>
       </w:tr>
       <w:tr>
-        <w:tblPrEx>
-          <w:tblCellMar>
-            <w:top w:w="0" w:type="dxa"/>
-            <w:bottom w:w="0" w:type="dxa"/>
-          </w:tblCellMar>
-        </w:tblPrEx>
         <w:tc>
           <w:tcPr>
             <w:tcW w:w="2400" w:type="dxa"/>
@@ -4068,12 +3900,6 @@
         </w:tc>
       </w:tr>
       <w:tr>
-        <w:tblPrEx>
-          <w:tblCellMar>
-            <w:top w:w="0" w:type="dxa"/>
-            <w:bottom w:w="0" w:type="dxa"/>
-          </w:tblCellMar>
-        </w:tblPrEx>
         <w:tc>
           <w:tcPr>
             <w:tcW w:w="2400" w:type="dxa"/>
@@ -4134,12 +3960,6 @@
         </w:tc>
       </w:tr>
       <w:tr>
-        <w:tblPrEx>
-          <w:tblCellMar>
-            <w:top w:w="0" w:type="dxa"/>
-            <w:bottom w:w="0" w:type="dxa"/>
-          </w:tblCellMar>
-        </w:tblPrEx>
         <w:tc>
           <w:tcPr>
             <w:tcW w:w="2400" w:type="dxa"/>
@@ -4218,12 +4038,6 @@
         </w:tc>
       </w:tr>
       <w:tr>
-        <w:tblPrEx>
-          <w:tblCellMar>
-            <w:top w:w="0" w:type="dxa"/>
-            <w:bottom w:w="0" w:type="dxa"/>
-          </w:tblCellMar>
-        </w:tblPrEx>
         <w:tc>
           <w:tcPr>
             <w:tcW w:w="2400" w:type="dxa"/>
@@ -4284,12 +4098,6 @@
         </w:tc>
       </w:tr>
       <w:tr>
-        <w:tblPrEx>
-          <w:tblCellMar>
-            <w:top w:w="0" w:type="dxa"/>
-            <w:bottom w:w="0" w:type="dxa"/>
-          </w:tblCellMar>
-        </w:tblPrEx>
         <w:tc>
           <w:tcPr>
             <w:tcW w:w="2400" w:type="dxa"/>
@@ -4350,12 +4158,6 @@
         </w:tc>
       </w:tr>
       <w:tr>
-        <w:tblPrEx>
-          <w:tblCellMar>
-            <w:top w:w="0" w:type="dxa"/>
-            <w:bottom w:w="0" w:type="dxa"/>
-          </w:tblCellMar>
-        </w:tblPrEx>
         <w:tc>
           <w:tcPr>
             <w:tcW w:w="2400" w:type="dxa"/>
@@ -4442,12 +4244,6 @@
         </w:tc>
       </w:tr>
       <w:tr>
-        <w:tblPrEx>
-          <w:tblCellMar>
-            <w:top w:w="0" w:type="dxa"/>
-            <w:bottom w:w="0" w:type="dxa"/>
-          </w:tblCellMar>
-        </w:tblPrEx>
         <w:tc>
           <w:tcPr>
             <w:tcW w:w="2400" w:type="dxa"/>
@@ -4536,12 +4332,6 @@
         </w:tc>
       </w:tr>
       <w:tr>
-        <w:tblPrEx>
-          <w:tblCellMar>
-            <w:top w:w="0" w:type="dxa"/>
-            <w:bottom w:w="0" w:type="dxa"/>
-          </w:tblCellMar>
-        </w:tblPrEx>
         <w:tc>
           <w:tcPr>
             <w:tcW w:w="2400" w:type="dxa"/>
@@ -4648,12 +4438,6 @@
         <w:gridCol w:w="1400"/>
       </w:tblGrid>
       <w:tr>
-        <w:tblPrEx>
-          <w:tblCellMar>
-            <w:top w:w="0" w:type="dxa"/>
-            <w:bottom w:w="0" w:type="dxa"/>
-          </w:tblCellMar>
-        </w:tblPrEx>
         <w:tc>
           <w:tcPr>
             <w:tcW w:w="2200" w:type="dxa"/>
@@ -4792,12 +4576,6 @@
         </w:tc>
       </w:tr>
       <w:tr>
-        <w:tblPrEx>
-          <w:tblCellMar>
-            <w:top w:w="0" w:type="dxa"/>
-            <w:bottom w:w="0" w:type="dxa"/>
-          </w:tblCellMar>
-        </w:tblPrEx>
         <w:tc>
           <w:tcPr>
             <w:tcW w:w="2200" w:type="dxa"/>
@@ -4932,12 +4710,6 @@
         </w:tc>
       </w:tr>
       <w:tr>
-        <w:tblPrEx>
-          <w:tblCellMar>
-            <w:top w:w="0" w:type="dxa"/>
-            <w:bottom w:w="0" w:type="dxa"/>
-          </w:tblCellMar>
-        </w:tblPrEx>
         <w:tc>
           <w:tcPr>
             <w:tcW w:w="2200" w:type="dxa"/>
@@ -5072,12 +4844,6 @@
         </w:tc>
       </w:tr>
       <w:tr>
-        <w:tblPrEx>
-          <w:tblCellMar>
-            <w:top w:w="0" w:type="dxa"/>
-            <w:bottom w:w="0" w:type="dxa"/>
-          </w:tblCellMar>
-        </w:tblPrEx>
         <w:tc>
           <w:tcPr>
             <w:tcW w:w="2200" w:type="dxa"/>
@@ -5214,12 +4980,6 @@
         </w:tc>
       </w:tr>
       <w:tr>
-        <w:tblPrEx>
-          <w:tblCellMar>
-            <w:top w:w="0" w:type="dxa"/>
-            <w:bottom w:w="0" w:type="dxa"/>
-          </w:tblCellMar>
-        </w:tblPrEx>
         <w:tc>
           <w:tcPr>
             <w:tcW w:w="2200" w:type="dxa"/>
@@ -5272,7 +5032,23 @@
                 <w:sz w:val="18"/>
                 <w:szCs w:val="18"/>
               </w:rPr>
-              <w:t>Revisión manual del archivo log_transaccional_Fecha.txt para confirmar estructura y niveles.</w:t>
+              <w:t>Revisión manual del archivo log_</w:t>
+            </w:r>
+            <w:r>
+              <w:rPr>
+                <w:color w:val="404040"/>
+                <w:sz w:val="18"/>
+                <w:szCs w:val="18"/>
+              </w:rPr>
+              <w:t>Audit</w:t>
+            </w:r>
+            <w:r>
+              <w:rPr>
+                <w:color w:val="404040"/>
+                <w:sz w:val="18"/>
+                <w:szCs w:val="18"/>
+              </w:rPr>
+              <w:t>_Fecha.txt para confirmar estructura y niveles.</w:t>
             </w:r>
           </w:p>
         </w:tc>
@@ -5336,12 +5112,6 @@
         </w:tc>
       </w:tr>
       <w:tr>
-        <w:tblPrEx>
-          <w:tblCellMar>
-            <w:top w:w="0" w:type="dxa"/>
-            <w:bottom w:w="0" w:type="dxa"/>
-          </w:tblCellMar>
-        </w:tblPrEx>
         <w:tc>
           <w:tcPr>
             <w:tcW w:w="2200" w:type="dxa"/>
@@ -5466,12 +5236,6 @@
         </w:tc>
       </w:tr>
       <w:tr>
-        <w:tblPrEx>
-          <w:tblCellMar>
-            <w:top w:w="0" w:type="dxa"/>
-            <w:bottom w:w="0" w:type="dxa"/>
-          </w:tblCellMar>
-        </w:tblPrEx>
         <w:tc>
           <w:tcPr>
             <w:tcW w:w="2200" w:type="dxa"/>
@@ -5618,12 +5382,6 @@
         <w:gridCol w:w="2500"/>
       </w:tblGrid>
       <w:tr>
-        <w:tblPrEx>
-          <w:tblCellMar>
-            <w:top w:w="0" w:type="dxa"/>
-            <w:bottom w:w="0" w:type="dxa"/>
-          </w:tblCellMar>
-        </w:tblPrEx>
         <w:tc>
           <w:tcPr>
             <w:tcW w:w="700" w:type="dxa"/>
@@ -5762,12 +5520,6 @@
         </w:tc>
       </w:tr>
       <w:tr>
-        <w:tblPrEx>
-          <w:tblCellMar>
-            <w:top w:w="0" w:type="dxa"/>
-            <w:bottom w:w="0" w:type="dxa"/>
-          </w:tblCellMar>
-        </w:tblPrEx>
         <w:tc>
           <w:tcPr>
             <w:tcW w:w="700" w:type="dxa"/>
@@ -5900,12 +5652,6 @@
         </w:tc>
       </w:tr>
       <w:tr>
-        <w:tblPrEx>
-          <w:tblCellMar>
-            <w:top w:w="0" w:type="dxa"/>
-            <w:bottom w:w="0" w:type="dxa"/>
-          </w:tblCellMar>
-        </w:tblPrEx>
         <w:tc>
           <w:tcPr>
             <w:tcW w:w="700" w:type="dxa"/>
@@ -6030,12 +5776,6 @@
         </w:tc>
       </w:tr>
       <w:tr>
-        <w:tblPrEx>
-          <w:tblCellMar>
-            <w:top w:w="0" w:type="dxa"/>
-            <w:bottom w:w="0" w:type="dxa"/>
-          </w:tblCellMar>
-        </w:tblPrEx>
         <w:tc>
           <w:tcPr>
             <w:tcW w:w="700" w:type="dxa"/>
@@ -6160,12 +5900,6 @@
         </w:tc>
       </w:tr>
       <w:tr>
-        <w:tblPrEx>
-          <w:tblCellMar>
-            <w:top w:w="0" w:type="dxa"/>
-            <w:bottom w:w="0" w:type="dxa"/>
-          </w:tblCellMar>
-        </w:tblPrEx>
         <w:tc>
           <w:tcPr>
             <w:tcW w:w="700" w:type="dxa"/>
@@ -6345,12 +6079,6 @@
         <w:gridCol w:w="7160"/>
       </w:tblGrid>
       <w:tr>
-        <w:tblPrEx>
-          <w:tblCellMar>
-            <w:top w:w="0" w:type="dxa"/>
-            <w:bottom w:w="0" w:type="dxa"/>
-          </w:tblCellMar>
-        </w:tblPrEx>
         <w:tc>
           <w:tcPr>
             <w:tcW w:w="2200" w:type="dxa"/>
@@ -6421,12 +6149,6 @@
         </w:tc>
       </w:tr>
       <w:tr>
-        <w:tblPrEx>
-          <w:tblCellMar>
-            <w:top w:w="0" w:type="dxa"/>
-            <w:bottom w:w="0" w:type="dxa"/>
-          </w:tblCellMar>
-        </w:tblPrEx>
         <w:tc>
           <w:tcPr>
             <w:tcW w:w="2200" w:type="dxa"/>
@@ -6487,12 +6209,6 @@
         </w:tc>
       </w:tr>
       <w:tr>
-        <w:tblPrEx>
-          <w:tblCellMar>
-            <w:top w:w="0" w:type="dxa"/>
-            <w:bottom w:w="0" w:type="dxa"/>
-          </w:tblCellMar>
-        </w:tblPrEx>
         <w:tc>
           <w:tcPr>
             <w:tcW w:w="2200" w:type="dxa"/>
@@ -6553,12 +6269,6 @@
         </w:tc>
       </w:tr>
       <w:tr>
-        <w:tblPrEx>
-          <w:tblCellMar>
-            <w:top w:w="0" w:type="dxa"/>
-            <w:bottom w:w="0" w:type="dxa"/>
-          </w:tblCellMar>
-        </w:tblPrEx>
         <w:tc>
           <w:tcPr>
             <w:tcW w:w="2200" w:type="dxa"/>
@@ -6621,12 +6331,6 @@
         </w:tc>
       </w:tr>
       <w:tr>
-        <w:tblPrEx>
-          <w:tblCellMar>
-            <w:top w:w="0" w:type="dxa"/>
-            <w:bottom w:w="0" w:type="dxa"/>
-          </w:tblCellMar>
-        </w:tblPrEx>
         <w:tc>
           <w:tcPr>
             <w:tcW w:w="2200" w:type="dxa"/>
@@ -6705,12 +6409,6 @@
         </w:tc>
       </w:tr>
       <w:tr>
-        <w:tblPrEx>
-          <w:tblCellMar>
-            <w:top w:w="0" w:type="dxa"/>
-            <w:bottom w:w="0" w:type="dxa"/>
-          </w:tblCellMar>
-        </w:tblPrEx>
         <w:tc>
           <w:tcPr>
             <w:tcW w:w="2200" w:type="dxa"/>
@@ -6843,12 +6541,6 @@
         </w:tc>
       </w:tr>
       <w:tr>
-        <w:tblPrEx>
-          <w:tblCellMar>
-            <w:top w:w="0" w:type="dxa"/>
-            <w:bottom w:w="0" w:type="dxa"/>
-          </w:tblCellMar>
-        </w:tblPrEx>
         <w:tc>
           <w:tcPr>
             <w:tcW w:w="2200" w:type="dxa"/>
@@ -6955,12 +6647,6 @@
         </w:tc>
       </w:tr>
       <w:tr>
-        <w:tblPrEx>
-          <w:tblCellMar>
-            <w:top w:w="0" w:type="dxa"/>
-            <w:bottom w:w="0" w:type="dxa"/>
-          </w:tblCellMar>
-        </w:tblPrEx>
         <w:tc>
           <w:tcPr>
             <w:tcW w:w="2200" w:type="dxa"/>
@@ -7012,12 +6698,6 @@
         </w:tc>
       </w:tr>
       <w:tr>
-        <w:tblPrEx>
-          <w:tblCellMar>
-            <w:top w:w="0" w:type="dxa"/>
-            <w:bottom w:w="0" w:type="dxa"/>
-          </w:tblCellMar>
-        </w:tblPrEx>
         <w:tc>
           <w:tcPr>
             <w:tcW w:w="2200" w:type="dxa"/>
@@ -7078,12 +6758,6 @@
         </w:tc>
       </w:tr>
       <w:tr>
-        <w:tblPrEx>
-          <w:tblCellMar>
-            <w:top w:w="0" w:type="dxa"/>
-            <w:bottom w:w="0" w:type="dxa"/>
-          </w:tblCellMar>
-        </w:tblPrEx>
         <w:tc>
           <w:tcPr>
             <w:tcW w:w="2200" w:type="dxa"/>
@@ -7135,12 +6809,6 @@
         </w:tc>
       </w:tr>
       <w:tr>
-        <w:tblPrEx>
-          <w:tblCellMar>
-            <w:top w:w="0" w:type="dxa"/>
-            <w:bottom w:w="0" w:type="dxa"/>
-          </w:tblCellMar>
-        </w:tblPrEx>
         <w:tc>
           <w:tcPr>
             <w:tcW w:w="2200" w:type="dxa"/>
@@ -7232,12 +6900,6 @@
         <w:gridCol w:w="7160"/>
       </w:tblGrid>
       <w:tr>
-        <w:tblPrEx>
-          <w:tblCellMar>
-            <w:top w:w="0" w:type="dxa"/>
-            <w:bottom w:w="0" w:type="dxa"/>
-          </w:tblCellMar>
-        </w:tblPrEx>
         <w:tc>
           <w:tcPr>
             <w:tcW w:w="2200" w:type="dxa"/>
@@ -7308,12 +6970,6 @@
         </w:tc>
       </w:tr>
       <w:tr>
-        <w:tblPrEx>
-          <w:tblCellMar>
-            <w:top w:w="0" w:type="dxa"/>
-            <w:bottom w:w="0" w:type="dxa"/>
-          </w:tblCellMar>
-        </w:tblPrEx>
         <w:tc>
           <w:tcPr>
             <w:tcW w:w="2200" w:type="dxa"/>
@@ -7374,12 +7030,6 @@
         </w:tc>
       </w:tr>
       <w:tr>
-        <w:tblPrEx>
-          <w:tblCellMar>
-            <w:top w:w="0" w:type="dxa"/>
-            <w:bottom w:w="0" w:type="dxa"/>
-          </w:tblCellMar>
-        </w:tblPrEx>
         <w:tc>
           <w:tcPr>
             <w:tcW w:w="2200" w:type="dxa"/>
@@ -7440,12 +7090,6 @@
         </w:tc>
       </w:tr>
       <w:tr>
-        <w:tblPrEx>
-          <w:tblCellMar>
-            <w:top w:w="0" w:type="dxa"/>
-            <w:bottom w:w="0" w:type="dxa"/>
-          </w:tblCellMar>
-        </w:tblPrEx>
         <w:tc>
           <w:tcPr>
             <w:tcW w:w="2200" w:type="dxa"/>
@@ -7508,12 +7152,6 @@
         </w:tc>
       </w:tr>
       <w:tr>
-        <w:tblPrEx>
-          <w:tblCellMar>
-            <w:top w:w="0" w:type="dxa"/>
-            <w:bottom w:w="0" w:type="dxa"/>
-          </w:tblCellMar>
-        </w:tblPrEx>
         <w:tc>
           <w:tcPr>
             <w:tcW w:w="2200" w:type="dxa"/>
@@ -7610,12 +7248,6 @@
         </w:tc>
       </w:tr>
       <w:tr>
-        <w:tblPrEx>
-          <w:tblCellMar>
-            <w:top w:w="0" w:type="dxa"/>
-            <w:bottom w:w="0" w:type="dxa"/>
-          </w:tblCellMar>
-        </w:tblPrEx>
         <w:tc>
           <w:tcPr>
             <w:tcW w:w="2200" w:type="dxa"/>
@@ -7712,12 +7344,6 @@
         </w:tc>
       </w:tr>
       <w:tr>
-        <w:tblPrEx>
-          <w:tblCellMar>
-            <w:top w:w="0" w:type="dxa"/>
-            <w:bottom w:w="0" w:type="dxa"/>
-          </w:tblCellMar>
-        </w:tblPrEx>
         <w:tc>
           <w:tcPr>
             <w:tcW w:w="2200" w:type="dxa"/>
@@ -7796,12 +7422,6 @@
         </w:tc>
       </w:tr>
       <w:tr>
-        <w:tblPrEx>
-          <w:tblCellMar>
-            <w:top w:w="0" w:type="dxa"/>
-            <w:bottom w:w="0" w:type="dxa"/>
-          </w:tblCellMar>
-        </w:tblPrEx>
         <w:tc>
           <w:tcPr>
             <w:tcW w:w="2200" w:type="dxa"/>
@@ -7853,12 +7473,6 @@
         </w:tc>
       </w:tr>
       <w:tr>
-        <w:tblPrEx>
-          <w:tblCellMar>
-            <w:top w:w="0" w:type="dxa"/>
-            <w:bottom w:w="0" w:type="dxa"/>
-          </w:tblCellMar>
-        </w:tblPrEx>
         <w:tc>
           <w:tcPr>
             <w:tcW w:w="2200" w:type="dxa"/>
@@ -7919,12 +7533,6 @@
         </w:tc>
       </w:tr>
       <w:tr>
-        <w:tblPrEx>
-          <w:tblCellMar>
-            <w:top w:w="0" w:type="dxa"/>
-            <w:bottom w:w="0" w:type="dxa"/>
-          </w:tblCellMar>
-        </w:tblPrEx>
         <w:tc>
           <w:tcPr>
             <w:tcW w:w="2200" w:type="dxa"/>
@@ -7976,12 +7584,6 @@
         </w:tc>
       </w:tr>
       <w:tr>
-        <w:tblPrEx>
-          <w:tblCellMar>
-            <w:top w:w="0" w:type="dxa"/>
-            <w:bottom w:w="0" w:type="dxa"/>
-          </w:tblCellMar>
-        </w:tblPrEx>
         <w:tc>
           <w:tcPr>
             <w:tcW w:w="2200" w:type="dxa"/>
@@ -8073,12 +7675,6 @@
         <w:gridCol w:w="7160"/>
       </w:tblGrid>
       <w:tr>
-        <w:tblPrEx>
-          <w:tblCellMar>
-            <w:top w:w="0" w:type="dxa"/>
-            <w:bottom w:w="0" w:type="dxa"/>
-          </w:tblCellMar>
-        </w:tblPrEx>
         <w:tc>
           <w:tcPr>
             <w:tcW w:w="2200" w:type="dxa"/>
@@ -8150,12 +7746,6 @@
         </w:tc>
       </w:tr>
       <w:tr>
-        <w:tblPrEx>
-          <w:tblCellMar>
-            <w:top w:w="0" w:type="dxa"/>
-            <w:bottom w:w="0" w:type="dxa"/>
-          </w:tblCellMar>
-        </w:tblPrEx>
         <w:tc>
           <w:tcPr>
             <w:tcW w:w="2200" w:type="dxa"/>
@@ -8216,12 +7806,6 @@
         </w:tc>
       </w:tr>
       <w:tr>
-        <w:tblPrEx>
-          <w:tblCellMar>
-            <w:top w:w="0" w:type="dxa"/>
-            <w:bottom w:w="0" w:type="dxa"/>
-          </w:tblCellMar>
-        </w:tblPrEx>
         <w:tc>
           <w:tcPr>
             <w:tcW w:w="2200" w:type="dxa"/>
@@ -8282,12 +7866,6 @@
         </w:tc>
       </w:tr>
       <w:tr>
-        <w:tblPrEx>
-          <w:tblCellMar>
-            <w:top w:w="0" w:type="dxa"/>
-            <w:bottom w:w="0" w:type="dxa"/>
-          </w:tblCellMar>
-        </w:tblPrEx>
         <w:tc>
           <w:tcPr>
             <w:tcW w:w="2200" w:type="dxa"/>
@@ -8350,12 +7928,6 @@
         </w:tc>
       </w:tr>
       <w:tr>
-        <w:tblPrEx>
-          <w:tblCellMar>
-            <w:top w:w="0" w:type="dxa"/>
-            <w:bottom w:w="0" w:type="dxa"/>
-          </w:tblCellMar>
-        </w:tblPrEx>
         <w:tc>
           <w:tcPr>
             <w:tcW w:w="2200" w:type="dxa"/>
@@ -8416,12 +7988,6 @@
         </w:tc>
       </w:tr>
       <w:tr>
-        <w:tblPrEx>
-          <w:tblCellMar>
-            <w:top w:w="0" w:type="dxa"/>
-            <w:bottom w:w="0" w:type="dxa"/>
-          </w:tblCellMar>
-        </w:tblPrEx>
         <w:tc>
           <w:tcPr>
             <w:tcW w:w="2200" w:type="dxa"/>
@@ -8518,12 +8084,6 @@
         </w:tc>
       </w:tr>
       <w:tr>
-        <w:tblPrEx>
-          <w:tblCellMar>
-            <w:top w:w="0" w:type="dxa"/>
-            <w:bottom w:w="0" w:type="dxa"/>
-          </w:tblCellMar>
-        </w:tblPrEx>
         <w:tc>
           <w:tcPr>
             <w:tcW w:w="2200" w:type="dxa"/>
@@ -8584,12 +8144,6 @@
         </w:tc>
       </w:tr>
       <w:tr>
-        <w:tblPrEx>
-          <w:tblCellMar>
-            <w:top w:w="0" w:type="dxa"/>
-            <w:bottom w:w="0" w:type="dxa"/>
-          </w:tblCellMar>
-        </w:tblPrEx>
         <w:tc>
           <w:tcPr>
             <w:tcW w:w="2200" w:type="dxa"/>
@@ -8641,12 +8195,6 @@
         </w:tc>
       </w:tr>
       <w:tr>
-        <w:tblPrEx>
-          <w:tblCellMar>
-            <w:top w:w="0" w:type="dxa"/>
-            <w:bottom w:w="0" w:type="dxa"/>
-          </w:tblCellMar>
-        </w:tblPrEx>
         <w:tc>
           <w:tcPr>
             <w:tcW w:w="2200" w:type="dxa"/>
@@ -8707,12 +8255,6 @@
         </w:tc>
       </w:tr>
       <w:tr>
-        <w:tblPrEx>
-          <w:tblCellMar>
-            <w:top w:w="0" w:type="dxa"/>
-            <w:bottom w:w="0" w:type="dxa"/>
-          </w:tblCellMar>
-        </w:tblPrEx>
         <w:tc>
           <w:tcPr>
             <w:tcW w:w="2200" w:type="dxa"/>
@@ -8764,12 +8306,6 @@
         </w:tc>
       </w:tr>
       <w:tr>
-        <w:tblPrEx>
-          <w:tblCellMar>
-            <w:top w:w="0" w:type="dxa"/>
-            <w:bottom w:w="0" w:type="dxa"/>
-          </w:tblCellMar>
-        </w:tblPrEx>
         <w:tc>
           <w:tcPr>
             <w:tcW w:w="2200" w:type="dxa"/>
@@ -8879,12 +8415,6 @@
         <w:gridCol w:w="7160"/>
       </w:tblGrid>
       <w:tr>
-        <w:tblPrEx>
-          <w:tblCellMar>
-            <w:top w:w="0" w:type="dxa"/>
-            <w:bottom w:w="0" w:type="dxa"/>
-          </w:tblCellMar>
-        </w:tblPrEx>
         <w:tc>
           <w:tcPr>
             <w:tcW w:w="2200" w:type="dxa"/>
@@ -8955,12 +8485,6 @@
         </w:tc>
       </w:tr>
       <w:tr>
-        <w:tblPrEx>
-          <w:tblCellMar>
-            <w:top w:w="0" w:type="dxa"/>
-            <w:bottom w:w="0" w:type="dxa"/>
-          </w:tblCellMar>
-        </w:tblPrEx>
         <w:tc>
           <w:tcPr>
             <w:tcW w:w="2200" w:type="dxa"/>
@@ -9021,12 +8545,6 @@
         </w:tc>
       </w:tr>
       <w:tr>
-        <w:tblPrEx>
-          <w:tblCellMar>
-            <w:top w:w="0" w:type="dxa"/>
-            <w:bottom w:w="0" w:type="dxa"/>
-          </w:tblCellMar>
-        </w:tblPrEx>
         <w:tc>
           <w:tcPr>
             <w:tcW w:w="2200" w:type="dxa"/>
@@ -9087,12 +8605,6 @@
         </w:tc>
       </w:tr>
       <w:tr>
-        <w:tblPrEx>
-          <w:tblCellMar>
-            <w:top w:w="0" w:type="dxa"/>
-            <w:bottom w:w="0" w:type="dxa"/>
-          </w:tblCellMar>
-        </w:tblPrEx>
         <w:tc>
           <w:tcPr>
             <w:tcW w:w="2200" w:type="dxa"/>
@@ -9155,12 +8667,6 @@
         </w:tc>
       </w:tr>
       <w:tr>
-        <w:tblPrEx>
-          <w:tblCellMar>
-            <w:top w:w="0" w:type="dxa"/>
-            <w:bottom w:w="0" w:type="dxa"/>
-          </w:tblCellMar>
-        </w:tblPrEx>
         <w:tc>
           <w:tcPr>
             <w:tcW w:w="2200" w:type="dxa"/>
@@ -9221,12 +8727,6 @@
         </w:tc>
       </w:tr>
       <w:tr>
-        <w:tblPrEx>
-          <w:tblCellMar>
-            <w:top w:w="0" w:type="dxa"/>
-            <w:bottom w:w="0" w:type="dxa"/>
-          </w:tblCellMar>
-        </w:tblPrEx>
         <w:tc>
           <w:tcPr>
             <w:tcW w:w="2200" w:type="dxa"/>
@@ -9359,12 +8859,6 @@
         </w:tc>
       </w:tr>
       <w:tr>
-        <w:tblPrEx>
-          <w:tblCellMar>
-            <w:top w:w="0" w:type="dxa"/>
-            <w:bottom w:w="0" w:type="dxa"/>
-          </w:tblCellMar>
-        </w:tblPrEx>
         <w:tc>
           <w:tcPr>
             <w:tcW w:w="2200" w:type="dxa"/>
@@ -9461,12 +8955,6 @@
         </w:tc>
       </w:tr>
       <w:tr>
-        <w:tblPrEx>
-          <w:tblCellMar>
-            <w:top w:w="0" w:type="dxa"/>
-            <w:bottom w:w="0" w:type="dxa"/>
-          </w:tblCellMar>
-        </w:tblPrEx>
         <w:tc>
           <w:tcPr>
             <w:tcW w:w="2200" w:type="dxa"/>
@@ -9518,12 +9006,6 @@
         </w:tc>
       </w:tr>
       <w:tr>
-        <w:tblPrEx>
-          <w:tblCellMar>
-            <w:top w:w="0" w:type="dxa"/>
-            <w:bottom w:w="0" w:type="dxa"/>
-          </w:tblCellMar>
-        </w:tblPrEx>
         <w:tc>
           <w:tcPr>
             <w:tcW w:w="2200" w:type="dxa"/>
@@ -9584,12 +9066,6 @@
         </w:tc>
       </w:tr>
       <w:tr>
-        <w:tblPrEx>
-          <w:tblCellMar>
-            <w:top w:w="0" w:type="dxa"/>
-            <w:bottom w:w="0" w:type="dxa"/>
-          </w:tblCellMar>
-        </w:tblPrEx>
         <w:tc>
           <w:tcPr>
             <w:tcW w:w="2200" w:type="dxa"/>
@@ -9641,12 +9117,6 @@
         </w:tc>
       </w:tr>
       <w:tr>
-        <w:tblPrEx>
-          <w:tblCellMar>
-            <w:top w:w="0" w:type="dxa"/>
-            <w:bottom w:w="0" w:type="dxa"/>
-          </w:tblCellMar>
-        </w:tblPrEx>
         <w:tc>
           <w:tcPr>
             <w:tcW w:w="2200" w:type="dxa"/>
@@ -9738,12 +9208,6 @@
         <w:gridCol w:w="7160"/>
       </w:tblGrid>
       <w:tr>
-        <w:tblPrEx>
-          <w:tblCellMar>
-            <w:top w:w="0" w:type="dxa"/>
-            <w:bottom w:w="0" w:type="dxa"/>
-          </w:tblCellMar>
-        </w:tblPrEx>
         <w:tc>
           <w:tcPr>
             <w:tcW w:w="2200" w:type="dxa"/>
@@ -9814,12 +9278,6 @@
         </w:tc>
       </w:tr>
       <w:tr>
-        <w:tblPrEx>
-          <w:tblCellMar>
-            <w:top w:w="0" w:type="dxa"/>
-            <w:bottom w:w="0" w:type="dxa"/>
-          </w:tblCellMar>
-        </w:tblPrEx>
         <w:tc>
           <w:tcPr>
             <w:tcW w:w="2200" w:type="dxa"/>
@@ -9880,12 +9338,6 @@
         </w:tc>
       </w:tr>
       <w:tr>
-        <w:tblPrEx>
-          <w:tblCellMar>
-            <w:top w:w="0" w:type="dxa"/>
-            <w:bottom w:w="0" w:type="dxa"/>
-          </w:tblCellMar>
-        </w:tblPrEx>
         <w:tc>
           <w:tcPr>
             <w:tcW w:w="2200" w:type="dxa"/>
@@ -9946,12 +9398,6 @@
         </w:tc>
       </w:tr>
       <w:tr>
-        <w:tblPrEx>
-          <w:tblCellMar>
-            <w:top w:w="0" w:type="dxa"/>
-            <w:bottom w:w="0" w:type="dxa"/>
-          </w:tblCellMar>
-        </w:tblPrEx>
         <w:tc>
           <w:tcPr>
             <w:tcW w:w="2200" w:type="dxa"/>
@@ -10014,12 +9460,6 @@
         </w:tc>
       </w:tr>
       <w:tr>
-        <w:tblPrEx>
-          <w:tblCellMar>
-            <w:top w:w="0" w:type="dxa"/>
-            <w:bottom w:w="0" w:type="dxa"/>
-          </w:tblCellMar>
-        </w:tblPrEx>
         <w:tc>
           <w:tcPr>
             <w:tcW w:w="2200" w:type="dxa"/>
@@ -10117,12 +9557,6 @@
         </w:tc>
       </w:tr>
       <w:tr>
-        <w:tblPrEx>
-          <w:tblCellMar>
-            <w:top w:w="0" w:type="dxa"/>
-            <w:bottom w:w="0" w:type="dxa"/>
-          </w:tblCellMar>
-        </w:tblPrEx>
         <w:tc>
           <w:tcPr>
             <w:tcW w:w="2200" w:type="dxa"/>
@@ -10255,12 +9689,6 @@
         </w:tc>
       </w:tr>
       <w:tr>
-        <w:tblPrEx>
-          <w:tblCellMar>
-            <w:top w:w="0" w:type="dxa"/>
-            <w:bottom w:w="0" w:type="dxa"/>
-          </w:tblCellMar>
-        </w:tblPrEx>
         <w:tc>
           <w:tcPr>
             <w:tcW w:w="2200" w:type="dxa"/>
@@ -10357,12 +9785,6 @@
         </w:tc>
       </w:tr>
       <w:tr>
-        <w:tblPrEx>
-          <w:tblCellMar>
-            <w:top w:w="0" w:type="dxa"/>
-            <w:bottom w:w="0" w:type="dxa"/>
-          </w:tblCellMar>
-        </w:tblPrEx>
         <w:tc>
           <w:tcPr>
             <w:tcW w:w="2200" w:type="dxa"/>
@@ -10414,12 +9836,6 @@
         </w:tc>
       </w:tr>
       <w:tr>
-        <w:tblPrEx>
-          <w:tblCellMar>
-            <w:top w:w="0" w:type="dxa"/>
-            <w:bottom w:w="0" w:type="dxa"/>
-          </w:tblCellMar>
-        </w:tblPrEx>
         <w:tc>
           <w:tcPr>
             <w:tcW w:w="2200" w:type="dxa"/>
@@ -10480,12 +9896,6 @@
         </w:tc>
       </w:tr>
       <w:tr>
-        <w:tblPrEx>
-          <w:tblCellMar>
-            <w:top w:w="0" w:type="dxa"/>
-            <w:bottom w:w="0" w:type="dxa"/>
-          </w:tblCellMar>
-        </w:tblPrEx>
         <w:tc>
           <w:tcPr>
             <w:tcW w:w="2200" w:type="dxa"/>
@@ -10537,12 +9947,6 @@
         </w:tc>
       </w:tr>
       <w:tr>
-        <w:tblPrEx>
-          <w:tblCellMar>
-            <w:top w:w="0" w:type="dxa"/>
-            <w:bottom w:w="0" w:type="dxa"/>
-          </w:tblCellMar>
-        </w:tblPrEx>
         <w:tc>
           <w:tcPr>
             <w:tcW w:w="2200" w:type="dxa"/>
@@ -10643,12 +10047,6 @@
         <w:gridCol w:w="7160"/>
       </w:tblGrid>
       <w:tr>
-        <w:tblPrEx>
-          <w:tblCellMar>
-            <w:top w:w="0" w:type="dxa"/>
-            <w:bottom w:w="0" w:type="dxa"/>
-          </w:tblCellMar>
-        </w:tblPrEx>
         <w:tc>
           <w:tcPr>
             <w:tcW w:w="2200" w:type="dxa"/>
@@ -10719,12 +10117,6 @@
         </w:tc>
       </w:tr>
       <w:tr>
-        <w:tblPrEx>
-          <w:tblCellMar>
-            <w:top w:w="0" w:type="dxa"/>
-            <w:bottom w:w="0" w:type="dxa"/>
-          </w:tblCellMar>
-        </w:tblPrEx>
         <w:tc>
           <w:tcPr>
             <w:tcW w:w="2200" w:type="dxa"/>
@@ -10785,12 +10177,6 @@
         </w:tc>
       </w:tr>
       <w:tr>
-        <w:tblPrEx>
-          <w:tblCellMar>
-            <w:top w:w="0" w:type="dxa"/>
-            <w:bottom w:w="0" w:type="dxa"/>
-          </w:tblCellMar>
-        </w:tblPrEx>
         <w:tc>
           <w:tcPr>
             <w:tcW w:w="2200" w:type="dxa"/>
@@ -10853,12 +10239,6 @@
         </w:tc>
       </w:tr>
       <w:tr>
-        <w:tblPrEx>
-          <w:tblCellMar>
-            <w:top w:w="0" w:type="dxa"/>
-            <w:bottom w:w="0" w:type="dxa"/>
-          </w:tblCellMar>
-        </w:tblPrEx>
         <w:tc>
           <w:tcPr>
             <w:tcW w:w="2200" w:type="dxa"/>
@@ -10921,12 +10301,6 @@
         </w:tc>
       </w:tr>
       <w:tr>
-        <w:tblPrEx>
-          <w:tblCellMar>
-            <w:top w:w="0" w:type="dxa"/>
-            <w:bottom w:w="0" w:type="dxa"/>
-          </w:tblCellMar>
-        </w:tblPrEx>
         <w:tc>
           <w:tcPr>
             <w:tcW w:w="2200" w:type="dxa"/>
@@ -10987,12 +10361,6 @@
         </w:tc>
       </w:tr>
       <w:tr>
-        <w:tblPrEx>
-          <w:tblCellMar>
-            <w:top w:w="0" w:type="dxa"/>
-            <w:bottom w:w="0" w:type="dxa"/>
-          </w:tblCellMar>
-        </w:tblPrEx>
         <w:tc>
           <w:tcPr>
             <w:tcW w:w="2200" w:type="dxa"/>
@@ -11063,12 +10431,6 @@
         </w:tc>
       </w:tr>
       <w:tr>
-        <w:tblPrEx>
-          <w:tblCellMar>
-            <w:top w:w="0" w:type="dxa"/>
-            <w:bottom w:w="0" w:type="dxa"/>
-          </w:tblCellMar>
-        </w:tblPrEx>
         <w:tc>
           <w:tcPr>
             <w:tcW w:w="2200" w:type="dxa"/>
@@ -11120,12 +10482,6 @@
         </w:tc>
       </w:tr>
       <w:tr>
-        <w:tblPrEx>
-          <w:tblCellMar>
-            <w:top w:w="0" w:type="dxa"/>
-            <w:bottom w:w="0" w:type="dxa"/>
-          </w:tblCellMar>
-        </w:tblPrEx>
         <w:tc>
           <w:tcPr>
             <w:tcW w:w="2200" w:type="dxa"/>
@@ -11186,12 +10542,6 @@
         </w:tc>
       </w:tr>
       <w:tr>
-        <w:tblPrEx>
-          <w:tblCellMar>
-            <w:top w:w="0" w:type="dxa"/>
-            <w:bottom w:w="0" w:type="dxa"/>
-          </w:tblCellMar>
-        </w:tblPrEx>
         <w:tc>
           <w:tcPr>
             <w:tcW w:w="2200" w:type="dxa"/>
@@ -11243,12 +10593,6 @@
         </w:tc>
       </w:tr>
       <w:tr>
-        <w:tblPrEx>
-          <w:tblCellMar>
-            <w:top w:w="0" w:type="dxa"/>
-            <w:bottom w:w="0" w:type="dxa"/>
-          </w:tblCellMar>
-        </w:tblPrEx>
         <w:tc>
           <w:tcPr>
             <w:tcW w:w="2200" w:type="dxa"/>
@@ -11340,12 +10684,6 @@
         <w:gridCol w:w="7160"/>
       </w:tblGrid>
       <w:tr>
-        <w:tblPrEx>
-          <w:tblCellMar>
-            <w:top w:w="0" w:type="dxa"/>
-            <w:bottom w:w="0" w:type="dxa"/>
-          </w:tblCellMar>
-        </w:tblPrEx>
         <w:tc>
           <w:tcPr>
             <w:tcW w:w="2200" w:type="dxa"/>
@@ -11416,12 +10754,6 @@
         </w:tc>
       </w:tr>
       <w:tr>
-        <w:tblPrEx>
-          <w:tblCellMar>
-            <w:top w:w="0" w:type="dxa"/>
-            <w:bottom w:w="0" w:type="dxa"/>
-          </w:tblCellMar>
-        </w:tblPrEx>
         <w:tc>
           <w:tcPr>
             <w:tcW w:w="2200" w:type="dxa"/>
@@ -11482,12 +10814,6 @@
         </w:tc>
       </w:tr>
       <w:tr>
-        <w:tblPrEx>
-          <w:tblCellMar>
-            <w:top w:w="0" w:type="dxa"/>
-            <w:bottom w:w="0" w:type="dxa"/>
-          </w:tblCellMar>
-        </w:tblPrEx>
         <w:tc>
           <w:tcPr>
             <w:tcW w:w="2200" w:type="dxa"/>
@@ -11572,12 +10898,6 @@
         </w:tc>
       </w:tr>
       <w:tr>
-        <w:tblPrEx>
-          <w:tblCellMar>
-            <w:top w:w="0" w:type="dxa"/>
-            <w:bottom w:w="0" w:type="dxa"/>
-          </w:tblCellMar>
-        </w:tblPrEx>
         <w:tc>
           <w:tcPr>
             <w:tcW w:w="2200" w:type="dxa"/>
@@ -11640,12 +10960,6 @@
         </w:tc>
       </w:tr>
       <w:tr>
-        <w:tblPrEx>
-          <w:tblCellMar>
-            <w:top w:w="0" w:type="dxa"/>
-            <w:bottom w:w="0" w:type="dxa"/>
-          </w:tblCellMar>
-        </w:tblPrEx>
         <w:tc>
           <w:tcPr>
             <w:tcW w:w="2200" w:type="dxa"/>
@@ -11706,12 +11020,6 @@
         </w:tc>
       </w:tr>
       <w:tr>
-        <w:tblPrEx>
-          <w:tblCellMar>
-            <w:top w:w="0" w:type="dxa"/>
-            <w:bottom w:w="0" w:type="dxa"/>
-          </w:tblCellMar>
-        </w:tblPrEx>
         <w:tc>
           <w:tcPr>
             <w:tcW w:w="2200" w:type="dxa"/>
@@ -11782,12 +11090,6 @@
         </w:tc>
       </w:tr>
       <w:tr>
-        <w:tblPrEx>
-          <w:tblCellMar>
-            <w:top w:w="0" w:type="dxa"/>
-            <w:bottom w:w="0" w:type="dxa"/>
-          </w:tblCellMar>
-        </w:tblPrEx>
         <w:tc>
           <w:tcPr>
             <w:tcW w:w="2200" w:type="dxa"/>
@@ -11839,12 +11141,6 @@
         </w:tc>
       </w:tr>
       <w:tr>
-        <w:tblPrEx>
-          <w:tblCellMar>
-            <w:top w:w="0" w:type="dxa"/>
-            <w:bottom w:w="0" w:type="dxa"/>
-          </w:tblCellMar>
-        </w:tblPrEx>
         <w:tc>
           <w:tcPr>
             <w:tcW w:w="2200" w:type="dxa"/>
@@ -11905,12 +11201,6 @@
         </w:tc>
       </w:tr>
       <w:tr>
-        <w:tblPrEx>
-          <w:tblCellMar>
-            <w:top w:w="0" w:type="dxa"/>
-            <w:bottom w:w="0" w:type="dxa"/>
-          </w:tblCellMar>
-        </w:tblPrEx>
         <w:tc>
           <w:tcPr>
             <w:tcW w:w="2200" w:type="dxa"/>
@@ -11962,12 +11252,6 @@
         </w:tc>
       </w:tr>
       <w:tr>
-        <w:tblPrEx>
-          <w:tblCellMar>
-            <w:top w:w="0" w:type="dxa"/>
-            <w:bottom w:w="0" w:type="dxa"/>
-          </w:tblCellMar>
-        </w:tblPrEx>
         <w:tc>
           <w:tcPr>
             <w:tcW w:w="2200" w:type="dxa"/>
@@ -12059,12 +11343,6 @@
         <w:gridCol w:w="7160"/>
       </w:tblGrid>
       <w:tr>
-        <w:tblPrEx>
-          <w:tblCellMar>
-            <w:top w:w="0" w:type="dxa"/>
-            <w:bottom w:w="0" w:type="dxa"/>
-          </w:tblCellMar>
-        </w:tblPrEx>
         <w:tc>
           <w:tcPr>
             <w:tcW w:w="2200" w:type="dxa"/>
@@ -12135,12 +11413,6 @@
         </w:tc>
       </w:tr>
       <w:tr>
-        <w:tblPrEx>
-          <w:tblCellMar>
-            <w:top w:w="0" w:type="dxa"/>
-            <w:bottom w:w="0" w:type="dxa"/>
-          </w:tblCellMar>
-        </w:tblPrEx>
         <w:tc>
           <w:tcPr>
             <w:tcW w:w="2200" w:type="dxa"/>
@@ -12201,12 +11473,6 @@
         </w:tc>
       </w:tr>
       <w:tr>
-        <w:tblPrEx>
-          <w:tblCellMar>
-            <w:top w:w="0" w:type="dxa"/>
-            <w:bottom w:w="0" w:type="dxa"/>
-          </w:tblCellMar>
-        </w:tblPrEx>
         <w:tc>
           <w:tcPr>
             <w:tcW w:w="2200" w:type="dxa"/>
@@ -12269,12 +11535,6 @@
         </w:tc>
       </w:tr>
       <w:tr>
-        <w:tblPrEx>
-          <w:tblCellMar>
-            <w:top w:w="0" w:type="dxa"/>
-            <w:bottom w:w="0" w:type="dxa"/>
-          </w:tblCellMar>
-        </w:tblPrEx>
         <w:tc>
           <w:tcPr>
             <w:tcW w:w="2200" w:type="dxa"/>
@@ -12335,12 +11595,6 @@
         </w:tc>
       </w:tr>
       <w:tr>
-        <w:tblPrEx>
-          <w:tblCellMar>
-            <w:top w:w="0" w:type="dxa"/>
-            <w:bottom w:w="0" w:type="dxa"/>
-          </w:tblCellMar>
-        </w:tblPrEx>
         <w:tc>
           <w:tcPr>
             <w:tcW w:w="2200" w:type="dxa"/>
@@ -12401,12 +11655,6 @@
         </w:tc>
       </w:tr>
       <w:tr>
-        <w:tblPrEx>
-          <w:tblCellMar>
-            <w:top w:w="0" w:type="dxa"/>
-            <w:bottom w:w="0" w:type="dxa"/>
-          </w:tblCellMar>
-        </w:tblPrEx>
         <w:tc>
           <w:tcPr>
             <w:tcW w:w="2200" w:type="dxa"/>
@@ -12504,12 +11752,6 @@
         </w:tc>
       </w:tr>
       <w:tr>
-        <w:tblPrEx>
-          <w:tblCellMar>
-            <w:top w:w="0" w:type="dxa"/>
-            <w:bottom w:w="0" w:type="dxa"/>
-          </w:tblCellMar>
-        </w:tblPrEx>
         <w:tc>
           <w:tcPr>
             <w:tcW w:w="2200" w:type="dxa"/>
@@ -12561,12 +11803,6 @@
         </w:tc>
       </w:tr>
       <w:tr>
-        <w:tblPrEx>
-          <w:tblCellMar>
-            <w:top w:w="0" w:type="dxa"/>
-            <w:bottom w:w="0" w:type="dxa"/>
-          </w:tblCellMar>
-        </w:tblPrEx>
         <w:tc>
           <w:tcPr>
             <w:tcW w:w="2200" w:type="dxa"/>
@@ -12627,12 +11863,6 @@
         </w:tc>
       </w:tr>
       <w:tr>
-        <w:tblPrEx>
-          <w:tblCellMar>
-            <w:top w:w="0" w:type="dxa"/>
-            <w:bottom w:w="0" w:type="dxa"/>
-          </w:tblCellMar>
-        </w:tblPrEx>
         <w:tc>
           <w:tcPr>
             <w:tcW w:w="2200" w:type="dxa"/>
@@ -12684,12 +11914,6 @@
         </w:tc>
       </w:tr>
       <w:tr>
-        <w:tblPrEx>
-          <w:tblCellMar>
-            <w:top w:w="0" w:type="dxa"/>
-            <w:bottom w:w="0" w:type="dxa"/>
-          </w:tblCellMar>
-        </w:tblPrEx>
         <w:tc>
           <w:tcPr>
             <w:tcW w:w="2200" w:type="dxa"/>
@@ -12808,12 +12032,6 @@
         <w:gridCol w:w="7160"/>
       </w:tblGrid>
       <w:tr>
-        <w:tblPrEx>
-          <w:tblCellMar>
-            <w:top w:w="0" w:type="dxa"/>
-            <w:bottom w:w="0" w:type="dxa"/>
-          </w:tblCellMar>
-        </w:tblPrEx>
         <w:tc>
           <w:tcPr>
             <w:tcW w:w="2200" w:type="dxa"/>
@@ -12884,12 +12102,6 @@
         </w:tc>
       </w:tr>
       <w:tr>
-        <w:tblPrEx>
-          <w:tblCellMar>
-            <w:top w:w="0" w:type="dxa"/>
-            <w:bottom w:w="0" w:type="dxa"/>
-          </w:tblCellMar>
-        </w:tblPrEx>
         <w:tc>
           <w:tcPr>
             <w:tcW w:w="2200" w:type="dxa"/>
@@ -12950,12 +12162,6 @@
         </w:tc>
       </w:tr>
       <w:tr>
-        <w:tblPrEx>
-          <w:tblCellMar>
-            <w:top w:w="0" w:type="dxa"/>
-            <w:bottom w:w="0" w:type="dxa"/>
-          </w:tblCellMar>
-        </w:tblPrEx>
         <w:tc>
           <w:tcPr>
             <w:tcW w:w="2200" w:type="dxa"/>
@@ -13040,12 +12246,6 @@
         </w:tc>
       </w:tr>
       <w:tr>
-        <w:tblPrEx>
-          <w:tblCellMar>
-            <w:top w:w="0" w:type="dxa"/>
-            <w:bottom w:w="0" w:type="dxa"/>
-          </w:tblCellMar>
-        </w:tblPrEx>
         <w:tc>
           <w:tcPr>
             <w:tcW w:w="2200" w:type="dxa"/>
@@ -13108,12 +12308,6 @@
         </w:tc>
       </w:tr>
       <w:tr>
-        <w:tblPrEx>
-          <w:tblCellMar>
-            <w:top w:w="0" w:type="dxa"/>
-            <w:bottom w:w="0" w:type="dxa"/>
-          </w:tblCellMar>
-        </w:tblPrEx>
         <w:tc>
           <w:tcPr>
             <w:tcW w:w="2200" w:type="dxa"/>
@@ -13192,12 +12386,6 @@
         </w:tc>
       </w:tr>
       <w:tr>
-        <w:tblPrEx>
-          <w:tblCellMar>
-            <w:top w:w="0" w:type="dxa"/>
-            <w:bottom w:w="0" w:type="dxa"/>
-          </w:tblCellMar>
-        </w:tblPrEx>
         <w:tc>
           <w:tcPr>
             <w:tcW w:w="2200" w:type="dxa"/>
@@ -13330,12 +12518,6 @@
         </w:tc>
       </w:tr>
       <w:tr>
-        <w:tblPrEx>
-          <w:tblCellMar>
-            <w:top w:w="0" w:type="dxa"/>
-            <w:bottom w:w="0" w:type="dxa"/>
-          </w:tblCellMar>
-        </w:tblPrEx>
         <w:tc>
           <w:tcPr>
             <w:tcW w:w="2200" w:type="dxa"/>
@@ -13387,12 +12569,6 @@
         </w:tc>
       </w:tr>
       <w:tr>
-        <w:tblPrEx>
-          <w:tblCellMar>
-            <w:top w:w="0" w:type="dxa"/>
-            <w:bottom w:w="0" w:type="dxa"/>
-          </w:tblCellMar>
-        </w:tblPrEx>
         <w:tc>
           <w:tcPr>
             <w:tcW w:w="2200" w:type="dxa"/>
@@ -13453,12 +12629,6 @@
         </w:tc>
       </w:tr>
       <w:tr>
-        <w:tblPrEx>
-          <w:tblCellMar>
-            <w:top w:w="0" w:type="dxa"/>
-            <w:bottom w:w="0" w:type="dxa"/>
-          </w:tblCellMar>
-        </w:tblPrEx>
         <w:tc>
           <w:tcPr>
             <w:tcW w:w="2200" w:type="dxa"/>
@@ -13510,12 +12680,6 @@
         </w:tc>
       </w:tr>
       <w:tr>
-        <w:tblPrEx>
-          <w:tblCellMar>
-            <w:top w:w="0" w:type="dxa"/>
-            <w:bottom w:w="0" w:type="dxa"/>
-          </w:tblCellMar>
-        </w:tblPrEx>
         <w:tc>
           <w:tcPr>
             <w:tcW w:w="2200" w:type="dxa"/>
@@ -13607,12 +12771,6 @@
         <w:gridCol w:w="7160"/>
       </w:tblGrid>
       <w:tr>
-        <w:tblPrEx>
-          <w:tblCellMar>
-            <w:top w:w="0" w:type="dxa"/>
-            <w:bottom w:w="0" w:type="dxa"/>
-          </w:tblCellMar>
-        </w:tblPrEx>
         <w:tc>
           <w:tcPr>
             <w:tcW w:w="2200" w:type="dxa"/>
@@ -13683,12 +12841,6 @@
         </w:tc>
       </w:tr>
       <w:tr>
-        <w:tblPrEx>
-          <w:tblCellMar>
-            <w:top w:w="0" w:type="dxa"/>
-            <w:bottom w:w="0" w:type="dxa"/>
-          </w:tblCellMar>
-        </w:tblPrEx>
         <w:tc>
           <w:tcPr>
             <w:tcW w:w="2200" w:type="dxa"/>
@@ -13749,12 +12901,6 @@
         </w:tc>
       </w:tr>
       <w:tr>
-        <w:tblPrEx>
-          <w:tblCellMar>
-            <w:top w:w="0" w:type="dxa"/>
-            <w:bottom w:w="0" w:type="dxa"/>
-          </w:tblCellMar>
-        </w:tblPrEx>
         <w:tc>
           <w:tcPr>
             <w:tcW w:w="2200" w:type="dxa"/>
@@ -13817,12 +12963,6 @@
         </w:tc>
       </w:tr>
       <w:tr>
-        <w:tblPrEx>
-          <w:tblCellMar>
-            <w:top w:w="0" w:type="dxa"/>
-            <w:bottom w:w="0" w:type="dxa"/>
-          </w:tblCellMar>
-        </w:tblPrEx>
         <w:tc>
           <w:tcPr>
             <w:tcW w:w="2200" w:type="dxa"/>
@@ -13885,12 +13025,6 @@
         </w:tc>
       </w:tr>
       <w:tr>
-        <w:tblPrEx>
-          <w:tblCellMar>
-            <w:top w:w="0" w:type="dxa"/>
-            <w:bottom w:w="0" w:type="dxa"/>
-          </w:tblCellMar>
-        </w:tblPrEx>
         <w:tc>
           <w:tcPr>
             <w:tcW w:w="2200" w:type="dxa"/>
@@ -13969,12 +13103,6 @@
         </w:tc>
       </w:tr>
       <w:tr>
-        <w:tblPrEx>
-          <w:tblCellMar>
-            <w:top w:w="0" w:type="dxa"/>
-            <w:bottom w:w="0" w:type="dxa"/>
-          </w:tblCellMar>
-        </w:tblPrEx>
         <w:tc>
           <w:tcPr>
             <w:tcW w:w="2200" w:type="dxa"/>
@@ -14035,12 +13163,6 @@
         </w:tc>
       </w:tr>
       <w:tr>
-        <w:tblPrEx>
-          <w:tblCellMar>
-            <w:top w:w="0" w:type="dxa"/>
-            <w:bottom w:w="0" w:type="dxa"/>
-          </w:tblCellMar>
-        </w:tblPrEx>
         <w:tc>
           <w:tcPr>
             <w:tcW w:w="2200" w:type="dxa"/>
@@ -14092,12 +13214,6 @@
         </w:tc>
       </w:tr>
       <w:tr>
-        <w:tblPrEx>
-          <w:tblCellMar>
-            <w:top w:w="0" w:type="dxa"/>
-            <w:bottom w:w="0" w:type="dxa"/>
-          </w:tblCellMar>
-        </w:tblPrEx>
         <w:tc>
           <w:tcPr>
             <w:tcW w:w="2200" w:type="dxa"/>
@@ -14158,12 +13274,6 @@
         </w:tc>
       </w:tr>
       <w:tr>
-        <w:tblPrEx>
-          <w:tblCellMar>
-            <w:top w:w="0" w:type="dxa"/>
-            <w:bottom w:w="0" w:type="dxa"/>
-          </w:tblCellMar>
-        </w:tblPrEx>
         <w:tc>
           <w:tcPr>
             <w:tcW w:w="2200" w:type="dxa"/>
@@ -14215,12 +13325,6 @@
         </w:tc>
       </w:tr>
       <w:tr>
-        <w:tblPrEx>
-          <w:tblCellMar>
-            <w:top w:w="0" w:type="dxa"/>
-            <w:bottom w:w="0" w:type="dxa"/>
-          </w:tblCellMar>
-        </w:tblPrEx>
         <w:tc>
           <w:tcPr>
             <w:tcW w:w="2200" w:type="dxa"/>
@@ -14312,12 +13416,6 @@
         <w:gridCol w:w="7160"/>
       </w:tblGrid>
       <w:tr>
-        <w:tblPrEx>
-          <w:tblCellMar>
-            <w:top w:w="0" w:type="dxa"/>
-            <w:bottom w:w="0" w:type="dxa"/>
-          </w:tblCellMar>
-        </w:tblPrEx>
         <w:tc>
           <w:tcPr>
             <w:tcW w:w="2200" w:type="dxa"/>
@@ -14388,12 +13486,6 @@
         </w:tc>
       </w:tr>
       <w:tr>
-        <w:tblPrEx>
-          <w:tblCellMar>
-            <w:top w:w="0" w:type="dxa"/>
-            <w:bottom w:w="0" w:type="dxa"/>
-          </w:tblCellMar>
-        </w:tblPrEx>
         <w:tc>
           <w:tcPr>
             <w:tcW w:w="2200" w:type="dxa"/>
@@ -14454,12 +13546,6 @@
         </w:tc>
       </w:tr>
       <w:tr>
-        <w:tblPrEx>
-          <w:tblCellMar>
-            <w:top w:w="0" w:type="dxa"/>
-            <w:bottom w:w="0" w:type="dxa"/>
-          </w:tblCellMar>
-        </w:tblPrEx>
         <w:tc>
           <w:tcPr>
             <w:tcW w:w="2200" w:type="dxa"/>
@@ -14522,12 +13608,6 @@
         </w:tc>
       </w:tr>
       <w:tr>
-        <w:tblPrEx>
-          <w:tblCellMar>
-            <w:top w:w="0" w:type="dxa"/>
-            <w:bottom w:w="0" w:type="dxa"/>
-          </w:tblCellMar>
-        </w:tblPrEx>
         <w:tc>
           <w:tcPr>
             <w:tcW w:w="2200" w:type="dxa"/>
@@ -14590,12 +13670,6 @@
         </w:tc>
       </w:tr>
       <w:tr>
-        <w:tblPrEx>
-          <w:tblCellMar>
-            <w:top w:w="0" w:type="dxa"/>
-            <w:bottom w:w="0" w:type="dxa"/>
-          </w:tblCellMar>
-        </w:tblPrEx>
         <w:tc>
           <w:tcPr>
             <w:tcW w:w="2200" w:type="dxa"/>
@@ -14692,12 +13766,6 @@
         </w:tc>
       </w:tr>
       <w:tr>
-        <w:tblPrEx>
-          <w:tblCellMar>
-            <w:top w:w="0" w:type="dxa"/>
-            <w:bottom w:w="0" w:type="dxa"/>
-          </w:tblCellMar>
-        </w:tblPrEx>
         <w:tc>
           <w:tcPr>
             <w:tcW w:w="2200" w:type="dxa"/>
@@ -14777,12 +13845,6 @@
         </w:tc>
       </w:tr>
       <w:tr>
-        <w:tblPrEx>
-          <w:tblCellMar>
-            <w:top w:w="0" w:type="dxa"/>
-            <w:bottom w:w="0" w:type="dxa"/>
-          </w:tblCellMar>
-        </w:tblPrEx>
         <w:tc>
           <w:tcPr>
             <w:tcW w:w="2200" w:type="dxa"/>
@@ -14834,12 +13896,6 @@
         </w:tc>
       </w:tr>
       <w:tr>
-        <w:tblPrEx>
-          <w:tblCellMar>
-            <w:top w:w="0" w:type="dxa"/>
-            <w:bottom w:w="0" w:type="dxa"/>
-          </w:tblCellMar>
-        </w:tblPrEx>
         <w:tc>
           <w:tcPr>
             <w:tcW w:w="2200" w:type="dxa"/>
@@ -14900,12 +13956,6 @@
         </w:tc>
       </w:tr>
       <w:tr>
-        <w:tblPrEx>
-          <w:tblCellMar>
-            <w:top w:w="0" w:type="dxa"/>
-            <w:bottom w:w="0" w:type="dxa"/>
-          </w:tblCellMar>
-        </w:tblPrEx>
         <w:tc>
           <w:tcPr>
             <w:tcW w:w="2200" w:type="dxa"/>
@@ -14957,12 +14007,6 @@
         </w:tc>
       </w:tr>
       <w:tr>
-        <w:tblPrEx>
-          <w:tblCellMar>
-            <w:top w:w="0" w:type="dxa"/>
-            <w:bottom w:w="0" w:type="dxa"/>
-          </w:tblCellMar>
-        </w:tblPrEx>
         <w:tc>
           <w:tcPr>
             <w:tcW w:w="2200" w:type="dxa"/>
@@ -15099,12 +14143,6 @@
         <w:gridCol w:w="7160"/>
       </w:tblGrid>
       <w:tr>
-        <w:tblPrEx>
-          <w:tblCellMar>
-            <w:top w:w="0" w:type="dxa"/>
-            <w:bottom w:w="0" w:type="dxa"/>
-          </w:tblCellMar>
-        </w:tblPrEx>
         <w:tc>
           <w:tcPr>
             <w:tcW w:w="2200" w:type="dxa"/>
@@ -15175,12 +14213,6 @@
         </w:tc>
       </w:tr>
       <w:tr>
-        <w:tblPrEx>
-          <w:tblCellMar>
-            <w:top w:w="0" w:type="dxa"/>
-            <w:bottom w:w="0" w:type="dxa"/>
-          </w:tblCellMar>
-        </w:tblPrEx>
         <w:tc>
           <w:tcPr>
             <w:tcW w:w="2200" w:type="dxa"/>
@@ -15241,12 +14273,6 @@
         </w:tc>
       </w:tr>
       <w:tr>
-        <w:tblPrEx>
-          <w:tblCellMar>
-            <w:top w:w="0" w:type="dxa"/>
-            <w:bottom w:w="0" w:type="dxa"/>
-          </w:tblCellMar>
-        </w:tblPrEx>
         <w:tc>
           <w:tcPr>
             <w:tcW w:w="2200" w:type="dxa"/>
@@ -15325,12 +14351,6 @@
         </w:tc>
       </w:tr>
       <w:tr>
-        <w:tblPrEx>
-          <w:tblCellMar>
-            <w:top w:w="0" w:type="dxa"/>
-            <w:bottom w:w="0" w:type="dxa"/>
-          </w:tblCellMar>
-        </w:tblPrEx>
         <w:tc>
           <w:tcPr>
             <w:tcW w:w="2200" w:type="dxa"/>
@@ -15393,12 +14413,6 @@
         </w:tc>
       </w:tr>
       <w:tr>
-        <w:tblPrEx>
-          <w:tblCellMar>
-            <w:top w:w="0" w:type="dxa"/>
-            <w:bottom w:w="0" w:type="dxa"/>
-          </w:tblCellMar>
-        </w:tblPrEx>
         <w:tc>
           <w:tcPr>
             <w:tcW w:w="2200" w:type="dxa"/>
@@ -15544,12 +14558,6 @@
         </w:tc>
       </w:tr>
       <w:tr>
-        <w:tblPrEx>
-          <w:tblCellMar>
-            <w:top w:w="0" w:type="dxa"/>
-            <w:bottom w:w="0" w:type="dxa"/>
-          </w:tblCellMar>
-        </w:tblPrEx>
         <w:tc>
           <w:tcPr>
             <w:tcW w:w="2200" w:type="dxa"/>
@@ -15682,12 +14690,6 @@
         </w:tc>
       </w:tr>
       <w:tr>
-        <w:tblPrEx>
-          <w:tblCellMar>
-            <w:top w:w="0" w:type="dxa"/>
-            <w:bottom w:w="0" w:type="dxa"/>
-          </w:tblCellMar>
-        </w:tblPrEx>
         <w:tc>
           <w:tcPr>
             <w:tcW w:w="2200" w:type="dxa"/>
@@ -15739,12 +14741,6 @@
         </w:tc>
       </w:tr>
       <w:tr>
-        <w:tblPrEx>
-          <w:tblCellMar>
-            <w:top w:w="0" w:type="dxa"/>
-            <w:bottom w:w="0" w:type="dxa"/>
-          </w:tblCellMar>
-        </w:tblPrEx>
         <w:tc>
           <w:tcPr>
             <w:tcW w:w="2200" w:type="dxa"/>
@@ -15805,12 +14801,6 @@
         </w:tc>
       </w:tr>
       <w:tr>
-        <w:tblPrEx>
-          <w:tblCellMar>
-            <w:top w:w="0" w:type="dxa"/>
-            <w:bottom w:w="0" w:type="dxa"/>
-          </w:tblCellMar>
-        </w:tblPrEx>
         <w:tc>
           <w:tcPr>
             <w:tcW w:w="2200" w:type="dxa"/>
@@ -15862,12 +14852,6 @@
         </w:tc>
       </w:tr>
       <w:tr>
-        <w:tblPrEx>
-          <w:tblCellMar>
-            <w:top w:w="0" w:type="dxa"/>
-            <w:bottom w:w="0" w:type="dxa"/>
-          </w:tblCellMar>
-        </w:tblPrEx>
         <w:tc>
           <w:tcPr>
             <w:tcW w:w="2200" w:type="dxa"/>
@@ -15977,12 +14961,6 @@
         <w:gridCol w:w="7160"/>
       </w:tblGrid>
       <w:tr>
-        <w:tblPrEx>
-          <w:tblCellMar>
-            <w:top w:w="0" w:type="dxa"/>
-            <w:bottom w:w="0" w:type="dxa"/>
-          </w:tblCellMar>
-        </w:tblPrEx>
         <w:tc>
           <w:tcPr>
             <w:tcW w:w="2200" w:type="dxa"/>
@@ -16053,12 +15031,6 @@
         </w:tc>
       </w:tr>
       <w:tr>
-        <w:tblPrEx>
-          <w:tblCellMar>
-            <w:top w:w="0" w:type="dxa"/>
-            <w:bottom w:w="0" w:type="dxa"/>
-          </w:tblCellMar>
-        </w:tblPrEx>
         <w:tc>
           <w:tcPr>
             <w:tcW w:w="2200" w:type="dxa"/>
@@ -16119,12 +15091,6 @@
         </w:tc>
       </w:tr>
       <w:tr>
-        <w:tblPrEx>
-          <w:tblCellMar>
-            <w:top w:w="0" w:type="dxa"/>
-            <w:bottom w:w="0" w:type="dxa"/>
-          </w:tblCellMar>
-        </w:tblPrEx>
         <w:tc>
           <w:tcPr>
             <w:tcW w:w="2200" w:type="dxa"/>
@@ -16185,12 +15151,6 @@
         </w:tc>
       </w:tr>
       <w:tr>
-        <w:tblPrEx>
-          <w:tblCellMar>
-            <w:top w:w="0" w:type="dxa"/>
-            <w:bottom w:w="0" w:type="dxa"/>
-          </w:tblCellMar>
-        </w:tblPrEx>
         <w:tc>
           <w:tcPr>
             <w:tcW w:w="2200" w:type="dxa"/>
@@ -16253,12 +15213,6 @@
         </w:tc>
       </w:tr>
       <w:tr>
-        <w:tblPrEx>
-          <w:tblCellMar>
-            <w:top w:w="0" w:type="dxa"/>
-            <w:bottom w:w="0" w:type="dxa"/>
-          </w:tblCellMar>
-        </w:tblPrEx>
         <w:tc>
           <w:tcPr>
             <w:tcW w:w="2200" w:type="dxa"/>
@@ -16401,12 +15355,6 @@
         </w:tc>
       </w:tr>
       <w:tr>
-        <w:tblPrEx>
-          <w:tblCellMar>
-            <w:top w:w="0" w:type="dxa"/>
-            <w:bottom w:w="0" w:type="dxa"/>
-          </w:tblCellMar>
-        </w:tblPrEx>
         <w:tc>
           <w:tcPr>
             <w:tcW w:w="2200" w:type="dxa"/>
@@ -16503,12 +15451,6 @@
         </w:tc>
       </w:tr>
       <w:tr>
-        <w:tblPrEx>
-          <w:tblCellMar>
-            <w:top w:w="0" w:type="dxa"/>
-            <w:bottom w:w="0" w:type="dxa"/>
-          </w:tblCellMar>
-        </w:tblPrEx>
         <w:tc>
           <w:tcPr>
             <w:tcW w:w="2200" w:type="dxa"/>
@@ -16560,12 +15502,6 @@
         </w:tc>
       </w:tr>
       <w:tr>
-        <w:tblPrEx>
-          <w:tblCellMar>
-            <w:top w:w="0" w:type="dxa"/>
-            <w:bottom w:w="0" w:type="dxa"/>
-          </w:tblCellMar>
-        </w:tblPrEx>
         <w:tc>
           <w:tcPr>
             <w:tcW w:w="2200" w:type="dxa"/>
@@ -16626,12 +15562,6 @@
         </w:tc>
       </w:tr>
       <w:tr>
-        <w:tblPrEx>
-          <w:tblCellMar>
-            <w:top w:w="0" w:type="dxa"/>
-            <w:bottom w:w="0" w:type="dxa"/>
-          </w:tblCellMar>
-        </w:tblPrEx>
         <w:tc>
           <w:tcPr>
             <w:tcW w:w="2200" w:type="dxa"/>
@@ -16683,12 +15613,6 @@
         </w:tc>
       </w:tr>
       <w:tr>
-        <w:tblPrEx>
-          <w:tblCellMar>
-            <w:top w:w="0" w:type="dxa"/>
-            <w:bottom w:w="0" w:type="dxa"/>
-          </w:tblCellMar>
-        </w:tblPrEx>
         <w:tc>
           <w:tcPr>
             <w:tcW w:w="2200" w:type="dxa"/>
@@ -16756,7 +15680,7 @@
     </w:p>
     <w:tbl>
       <w:tblPr>
-        <w:tblW w:w="9360" w:type="dxa"/>
+        <w:tblW w:w="10079" w:type="dxa"/>
         <w:tblBorders>
           <w:top w:val="single" w:sz="4" w:space="0" w:color="auto"/>
           <w:left w:val="single" w:sz="4" w:space="0" w:color="auto"/>
@@ -16778,18 +15702,12 @@
         <w:gridCol w:w="1106"/>
         <w:gridCol w:w="1146"/>
         <w:gridCol w:w="1420"/>
-        <w:gridCol w:w="1051"/>
+        <w:gridCol w:w="1770"/>
       </w:tblGrid>
       <w:tr>
-        <w:tblPrEx>
-          <w:tblCellMar>
-            <w:top w:w="0" w:type="dxa"/>
-            <w:bottom w:w="0" w:type="dxa"/>
-          </w:tblCellMar>
-        </w:tblPrEx>
-        <w:tc>
-          <w:tcPr>
-            <w:tcW w:w="900" w:type="dxa"/>
+        <w:tc>
+          <w:tcPr>
+            <w:tcW w:w="750" w:type="dxa"/>
             <w:tcBorders>
               <w:top w:val="single" w:sz="1" w:space="0" w:color="2E75B6"/>
               <w:left w:val="single" w:sz="1" w:space="0" w:color="2E75B6"/>
@@ -16823,7 +15741,7 @@
         </w:tc>
         <w:tc>
           <w:tcPr>
-            <w:tcW w:w="3500" w:type="dxa"/>
+            <w:tcW w:w="2578" w:type="dxa"/>
             <w:tcBorders>
               <w:top w:val="single" w:sz="1" w:space="0" w:color="2E75B6"/>
               <w:left w:val="single" w:sz="1" w:space="0" w:color="2E75B6"/>
@@ -16857,7 +15775,7 @@
         </w:tc>
         <w:tc>
           <w:tcPr>
-            <w:tcW w:w="1400" w:type="dxa"/>
+            <w:tcW w:w="1309" w:type="dxa"/>
             <w:tcBorders>
               <w:top w:val="single" w:sz="1" w:space="0" w:color="2E75B6"/>
               <w:left w:val="single" w:sz="1" w:space="0" w:color="2E75B6"/>
@@ -16891,7 +15809,7 @@
         </w:tc>
         <w:tc>
           <w:tcPr>
-            <w:tcW w:w="1160" w:type="dxa"/>
+            <w:tcW w:w="1106" w:type="dxa"/>
             <w:tcBorders>
               <w:top w:val="single" w:sz="1" w:space="0" w:color="2E75B6"/>
               <w:left w:val="single" w:sz="1" w:space="0" w:color="2E75B6"/>
@@ -16925,7 +15843,7 @@
         </w:tc>
         <w:tc>
           <w:tcPr>
-            <w:tcW w:w="1200" w:type="dxa"/>
+            <w:tcW w:w="1146" w:type="dxa"/>
             <w:tcBorders>
               <w:top w:val="single" w:sz="1" w:space="0" w:color="2E75B6"/>
               <w:left w:val="single" w:sz="1" w:space="0" w:color="2E75B6"/>
@@ -16959,7 +15877,7 @@
         </w:tc>
         <w:tc>
           <w:tcPr>
-            <w:tcW w:w="1200" w:type="dxa"/>
+            <w:tcW w:w="1420" w:type="dxa"/>
             <w:tcBorders>
               <w:top w:val="single" w:sz="1" w:space="0" w:color="2E75B6"/>
               <w:left w:val="single" w:sz="1" w:space="0" w:color="2E75B6"/>
@@ -16993,7 +15911,7 @@
         </w:tc>
         <w:tc>
           <w:tcPr>
-            <w:tcW w:w="1000" w:type="dxa"/>
+            <w:tcW w:w="1770" w:type="dxa"/>
             <w:tcBorders>
               <w:top w:val="single" w:sz="1" w:space="0" w:color="2E75B6"/>
               <w:left w:val="single" w:sz="1" w:space="0" w:color="2E75B6"/>
@@ -17027,15 +15945,9 @@
         </w:tc>
       </w:tr>
       <w:tr>
-        <w:tblPrEx>
-          <w:tblCellMar>
-            <w:top w:w="0" w:type="dxa"/>
-            <w:bottom w:w="0" w:type="dxa"/>
-          </w:tblCellMar>
-        </w:tblPrEx>
-        <w:tc>
-          <w:tcPr>
-            <w:tcW w:w="900" w:type="dxa"/>
+        <w:tc>
+          <w:tcPr>
+            <w:tcW w:w="750" w:type="dxa"/>
             <w:tcBorders>
               <w:top w:val="single" w:sz="1" w:space="0" w:color="CCCCCC"/>
               <w:left w:val="single" w:sz="1" w:space="0" w:color="CCCCCC"/>
@@ -17063,7 +15975,7 @@
         </w:tc>
         <w:tc>
           <w:tcPr>
-            <w:tcW w:w="3500" w:type="dxa"/>
+            <w:tcW w:w="2578" w:type="dxa"/>
             <w:tcBorders>
               <w:top w:val="single" w:sz="1" w:space="0" w:color="CCCCCC"/>
               <w:left w:val="single" w:sz="1" w:space="0" w:color="CCCCCC"/>
@@ -17091,7 +16003,7 @@
         </w:tc>
         <w:tc>
           <w:tcPr>
-            <w:tcW w:w="1400" w:type="dxa"/>
+            <w:tcW w:w="1309" w:type="dxa"/>
             <w:tcBorders>
               <w:top w:val="single" w:sz="1" w:space="0" w:color="CCCCCC"/>
               <w:left w:val="single" w:sz="1" w:space="0" w:color="CCCCCC"/>
@@ -17119,7 +16031,7 @@
         </w:tc>
         <w:tc>
           <w:tcPr>
-            <w:tcW w:w="1160" w:type="dxa"/>
+            <w:tcW w:w="1106" w:type="dxa"/>
             <w:tcBorders>
               <w:top w:val="single" w:sz="1" w:space="0" w:color="CCCCCC"/>
               <w:left w:val="single" w:sz="1" w:space="0" w:color="CCCCCC"/>
@@ -17149,7 +16061,7 @@
         </w:tc>
         <w:tc>
           <w:tcPr>
-            <w:tcW w:w="1200" w:type="dxa"/>
+            <w:tcW w:w="1146" w:type="dxa"/>
             <w:tcBorders>
               <w:top w:val="single" w:sz="1" w:space="0" w:color="CCCCCC"/>
               <w:left w:val="single" w:sz="1" w:space="0" w:color="CCCCCC"/>
@@ -17177,7 +16089,7 @@
         </w:tc>
         <w:tc>
           <w:tcPr>
-            <w:tcW w:w="1200" w:type="dxa"/>
+            <w:tcW w:w="1420" w:type="dxa"/>
             <w:tcBorders>
               <w:top w:val="single" w:sz="1" w:space="0" w:color="CCCCCC"/>
               <w:left w:val="single" w:sz="1" w:space="0" w:color="CCCCCC"/>
@@ -17207,7 +16119,7 @@
         </w:tc>
         <w:tc>
           <w:tcPr>
-            <w:tcW w:w="1000" w:type="dxa"/>
+            <w:tcW w:w="1770" w:type="dxa"/>
             <w:tcBorders>
               <w:top w:val="single" w:sz="1" w:space="0" w:color="CCCCCC"/>
               <w:left w:val="single" w:sz="1" w:space="0" w:color="CCCCCC"/>
@@ -17235,15 +16147,9 @@
         </w:tc>
       </w:tr>
       <w:tr>
-        <w:tblPrEx>
-          <w:tblCellMar>
-            <w:top w:w="0" w:type="dxa"/>
-            <w:bottom w:w="0" w:type="dxa"/>
-          </w:tblCellMar>
-        </w:tblPrEx>
-        <w:tc>
-          <w:tcPr>
-            <w:tcW w:w="900" w:type="dxa"/>
+        <w:tc>
+          <w:tcPr>
+            <w:tcW w:w="750" w:type="dxa"/>
             <w:tcBorders>
               <w:top w:val="single" w:sz="1" w:space="0" w:color="CCCCCC"/>
               <w:left w:val="single" w:sz="1" w:space="0" w:color="CCCCCC"/>
@@ -17271,7 +16177,7 @@
         </w:tc>
         <w:tc>
           <w:tcPr>
-            <w:tcW w:w="3500" w:type="dxa"/>
+            <w:tcW w:w="2578" w:type="dxa"/>
             <w:tcBorders>
               <w:top w:val="single" w:sz="1" w:space="0" w:color="CCCCCC"/>
               <w:left w:val="single" w:sz="1" w:space="0" w:color="CCCCCC"/>
@@ -17299,7 +16205,7 @@
         </w:tc>
         <w:tc>
           <w:tcPr>
-            <w:tcW w:w="1400" w:type="dxa"/>
+            <w:tcW w:w="1309" w:type="dxa"/>
             <w:tcBorders>
               <w:top w:val="single" w:sz="1" w:space="0" w:color="CCCCCC"/>
               <w:left w:val="single" w:sz="1" w:space="0" w:color="CCCCCC"/>
@@ -17327,7 +16233,7 @@
         </w:tc>
         <w:tc>
           <w:tcPr>
-            <w:tcW w:w="1160" w:type="dxa"/>
+            <w:tcW w:w="1106" w:type="dxa"/>
             <w:tcBorders>
               <w:top w:val="single" w:sz="1" w:space="0" w:color="CCCCCC"/>
               <w:left w:val="single" w:sz="1" w:space="0" w:color="CCCCCC"/>
@@ -17357,7 +16263,7 @@
         </w:tc>
         <w:tc>
           <w:tcPr>
-            <w:tcW w:w="1200" w:type="dxa"/>
+            <w:tcW w:w="1146" w:type="dxa"/>
             <w:tcBorders>
               <w:top w:val="single" w:sz="1" w:space="0" w:color="CCCCCC"/>
               <w:left w:val="single" w:sz="1" w:space="0" w:color="CCCCCC"/>
@@ -17385,7 +16291,7 @@
         </w:tc>
         <w:tc>
           <w:tcPr>
-            <w:tcW w:w="1200" w:type="dxa"/>
+            <w:tcW w:w="1420" w:type="dxa"/>
             <w:tcBorders>
               <w:top w:val="single" w:sz="1" w:space="0" w:color="CCCCCC"/>
               <w:left w:val="single" w:sz="1" w:space="0" w:color="CCCCCC"/>
@@ -17415,7 +16321,7 @@
         </w:tc>
         <w:tc>
           <w:tcPr>
-            <w:tcW w:w="1000" w:type="dxa"/>
+            <w:tcW w:w="1770" w:type="dxa"/>
             <w:tcBorders>
               <w:top w:val="single" w:sz="1" w:space="0" w:color="CCCCCC"/>
               <w:left w:val="single" w:sz="1" w:space="0" w:color="CCCCCC"/>
@@ -17443,15 +16349,9 @@
         </w:tc>
       </w:tr>
       <w:tr>
-        <w:tblPrEx>
-          <w:tblCellMar>
-            <w:top w:w="0" w:type="dxa"/>
-            <w:bottom w:w="0" w:type="dxa"/>
-          </w:tblCellMar>
-        </w:tblPrEx>
-        <w:tc>
-          <w:tcPr>
-            <w:tcW w:w="900" w:type="dxa"/>
+        <w:tc>
+          <w:tcPr>
+            <w:tcW w:w="750" w:type="dxa"/>
             <w:tcBorders>
               <w:top w:val="single" w:sz="1" w:space="0" w:color="CCCCCC"/>
               <w:left w:val="single" w:sz="1" w:space="0" w:color="CCCCCC"/>
@@ -17479,7 +16379,7 @@
         </w:tc>
         <w:tc>
           <w:tcPr>
-            <w:tcW w:w="3500" w:type="dxa"/>
+            <w:tcW w:w="2578" w:type="dxa"/>
             <w:tcBorders>
               <w:top w:val="single" w:sz="1" w:space="0" w:color="CCCCCC"/>
               <w:left w:val="single" w:sz="1" w:space="0" w:color="CCCCCC"/>
@@ -17507,7 +16407,7 @@
         </w:tc>
         <w:tc>
           <w:tcPr>
-            <w:tcW w:w="1400" w:type="dxa"/>
+            <w:tcW w:w="1309" w:type="dxa"/>
             <w:tcBorders>
               <w:top w:val="single" w:sz="1" w:space="0" w:color="CCCCCC"/>
               <w:left w:val="single" w:sz="1" w:space="0" w:color="CCCCCC"/>
@@ -17535,7 +16435,7 @@
         </w:tc>
         <w:tc>
           <w:tcPr>
-            <w:tcW w:w="1160" w:type="dxa"/>
+            <w:tcW w:w="1106" w:type="dxa"/>
             <w:tcBorders>
               <w:top w:val="single" w:sz="1" w:space="0" w:color="CCCCCC"/>
               <w:left w:val="single" w:sz="1" w:space="0" w:color="CCCCCC"/>
@@ -17565,7 +16465,7 @@
         </w:tc>
         <w:tc>
           <w:tcPr>
-            <w:tcW w:w="1200" w:type="dxa"/>
+            <w:tcW w:w="1146" w:type="dxa"/>
             <w:tcBorders>
               <w:top w:val="single" w:sz="1" w:space="0" w:color="CCCCCC"/>
               <w:left w:val="single" w:sz="1" w:space="0" w:color="CCCCCC"/>
@@ -17593,7 +16493,7 @@
         </w:tc>
         <w:tc>
           <w:tcPr>
-            <w:tcW w:w="1200" w:type="dxa"/>
+            <w:tcW w:w="1420" w:type="dxa"/>
             <w:tcBorders>
               <w:top w:val="single" w:sz="1" w:space="0" w:color="CCCCCC"/>
               <w:left w:val="single" w:sz="1" w:space="0" w:color="CCCCCC"/>
@@ -17623,7 +16523,7 @@
         </w:tc>
         <w:tc>
           <w:tcPr>
-            <w:tcW w:w="1000" w:type="dxa"/>
+            <w:tcW w:w="1770" w:type="dxa"/>
             <w:tcBorders>
               <w:top w:val="single" w:sz="1" w:space="0" w:color="CCCCCC"/>
               <w:left w:val="single" w:sz="1" w:space="0" w:color="CCCCCC"/>
@@ -17651,15 +16551,9 @@
         </w:tc>
       </w:tr>
       <w:tr>
-        <w:tblPrEx>
-          <w:tblCellMar>
-            <w:top w:w="0" w:type="dxa"/>
-            <w:bottom w:w="0" w:type="dxa"/>
-          </w:tblCellMar>
-        </w:tblPrEx>
-        <w:tc>
-          <w:tcPr>
-            <w:tcW w:w="900" w:type="dxa"/>
+        <w:tc>
+          <w:tcPr>
+            <w:tcW w:w="750" w:type="dxa"/>
             <w:tcBorders>
               <w:top w:val="single" w:sz="1" w:space="0" w:color="CCCCCC"/>
               <w:left w:val="single" w:sz="1" w:space="0" w:color="CCCCCC"/>
@@ -17687,7 +16581,7 @@
         </w:tc>
         <w:tc>
           <w:tcPr>
-            <w:tcW w:w="3500" w:type="dxa"/>
+            <w:tcW w:w="2578" w:type="dxa"/>
             <w:tcBorders>
               <w:top w:val="single" w:sz="1" w:space="0" w:color="CCCCCC"/>
               <w:left w:val="single" w:sz="1" w:space="0" w:color="CCCCCC"/>
@@ -17725,7 +16619,7 @@
         </w:tc>
         <w:tc>
           <w:tcPr>
-            <w:tcW w:w="1400" w:type="dxa"/>
+            <w:tcW w:w="1309" w:type="dxa"/>
             <w:tcBorders>
               <w:top w:val="single" w:sz="1" w:space="0" w:color="CCCCCC"/>
               <w:left w:val="single" w:sz="1" w:space="0" w:color="CCCCCC"/>
@@ -17753,7 +16647,7 @@
         </w:tc>
         <w:tc>
           <w:tcPr>
-            <w:tcW w:w="1160" w:type="dxa"/>
+            <w:tcW w:w="1106" w:type="dxa"/>
             <w:tcBorders>
               <w:top w:val="single" w:sz="1" w:space="0" w:color="CCCCCC"/>
               <w:left w:val="single" w:sz="1" w:space="0" w:color="CCCCCC"/>
@@ -17783,7 +16677,7 @@
         </w:tc>
         <w:tc>
           <w:tcPr>
-            <w:tcW w:w="1200" w:type="dxa"/>
+            <w:tcW w:w="1146" w:type="dxa"/>
             <w:tcBorders>
               <w:top w:val="single" w:sz="1" w:space="0" w:color="CCCCCC"/>
               <w:left w:val="single" w:sz="1" w:space="0" w:color="CCCCCC"/>
@@ -17811,7 +16705,7 @@
         </w:tc>
         <w:tc>
           <w:tcPr>
-            <w:tcW w:w="1200" w:type="dxa"/>
+            <w:tcW w:w="1420" w:type="dxa"/>
             <w:tcBorders>
               <w:top w:val="single" w:sz="1" w:space="0" w:color="CCCCCC"/>
               <w:left w:val="single" w:sz="1" w:space="0" w:color="CCCCCC"/>
@@ -17841,7 +16735,7 @@
         </w:tc>
         <w:tc>
           <w:tcPr>
-            <w:tcW w:w="1000" w:type="dxa"/>
+            <w:tcW w:w="1770" w:type="dxa"/>
             <w:tcBorders>
               <w:top w:val="single" w:sz="1" w:space="0" w:color="CCCCCC"/>
               <w:left w:val="single" w:sz="1" w:space="0" w:color="CCCCCC"/>
@@ -17869,15 +16763,9 @@
         </w:tc>
       </w:tr>
       <w:tr>
-        <w:tblPrEx>
-          <w:tblCellMar>
-            <w:top w:w="0" w:type="dxa"/>
-            <w:bottom w:w="0" w:type="dxa"/>
-          </w:tblCellMar>
-        </w:tblPrEx>
-        <w:tc>
-          <w:tcPr>
-            <w:tcW w:w="900" w:type="dxa"/>
+        <w:tc>
+          <w:tcPr>
+            <w:tcW w:w="750" w:type="dxa"/>
             <w:tcBorders>
               <w:top w:val="single" w:sz="1" w:space="0" w:color="CCCCCC"/>
               <w:left w:val="single" w:sz="1" w:space="0" w:color="CCCCCC"/>
@@ -17905,7 +16793,7 @@
         </w:tc>
         <w:tc>
           <w:tcPr>
-            <w:tcW w:w="3500" w:type="dxa"/>
+            <w:tcW w:w="2578" w:type="dxa"/>
             <w:tcBorders>
               <w:top w:val="single" w:sz="1" w:space="0" w:color="CCCCCC"/>
               <w:left w:val="single" w:sz="1" w:space="0" w:color="CCCCCC"/>
@@ -17933,7 +16821,7 @@
         </w:tc>
         <w:tc>
           <w:tcPr>
-            <w:tcW w:w="1400" w:type="dxa"/>
+            <w:tcW w:w="1309" w:type="dxa"/>
             <w:tcBorders>
               <w:top w:val="single" w:sz="1" w:space="0" w:color="CCCCCC"/>
               <w:left w:val="single" w:sz="1" w:space="0" w:color="CCCCCC"/>
@@ -17961,7 +16849,7 @@
         </w:tc>
         <w:tc>
           <w:tcPr>
-            <w:tcW w:w="1160" w:type="dxa"/>
+            <w:tcW w:w="1106" w:type="dxa"/>
             <w:tcBorders>
               <w:top w:val="single" w:sz="1" w:space="0" w:color="CCCCCC"/>
               <w:left w:val="single" w:sz="1" w:space="0" w:color="CCCCCC"/>
@@ -17991,7 +16879,7 @@
         </w:tc>
         <w:tc>
           <w:tcPr>
-            <w:tcW w:w="1200" w:type="dxa"/>
+            <w:tcW w:w="1146" w:type="dxa"/>
             <w:tcBorders>
               <w:top w:val="single" w:sz="1" w:space="0" w:color="CCCCCC"/>
               <w:left w:val="single" w:sz="1" w:space="0" w:color="CCCCCC"/>
@@ -18019,7 +16907,7 @@
         </w:tc>
         <w:tc>
           <w:tcPr>
-            <w:tcW w:w="1200" w:type="dxa"/>
+            <w:tcW w:w="1420" w:type="dxa"/>
             <w:tcBorders>
               <w:top w:val="single" w:sz="1" w:space="0" w:color="CCCCCC"/>
               <w:left w:val="single" w:sz="1" w:space="0" w:color="CCCCCC"/>
@@ -18049,7 +16937,7 @@
         </w:tc>
         <w:tc>
           <w:tcPr>
-            <w:tcW w:w="1000" w:type="dxa"/>
+            <w:tcW w:w="1770" w:type="dxa"/>
             <w:tcBorders>
               <w:top w:val="single" w:sz="1" w:space="0" w:color="CCCCCC"/>
               <w:left w:val="single" w:sz="1" w:space="0" w:color="CCCCCC"/>
@@ -18077,15 +16965,9 @@
         </w:tc>
       </w:tr>
       <w:tr>
-        <w:tblPrEx>
-          <w:tblCellMar>
-            <w:top w:w="0" w:type="dxa"/>
-            <w:bottom w:w="0" w:type="dxa"/>
-          </w:tblCellMar>
-        </w:tblPrEx>
-        <w:tc>
-          <w:tcPr>
-            <w:tcW w:w="900" w:type="dxa"/>
+        <w:tc>
+          <w:tcPr>
+            <w:tcW w:w="750" w:type="dxa"/>
             <w:tcBorders>
               <w:top w:val="single" w:sz="1" w:space="0" w:color="CCCCCC"/>
               <w:left w:val="single" w:sz="1" w:space="0" w:color="CCCCCC"/>
@@ -18113,7 +16995,7 @@
         </w:tc>
         <w:tc>
           <w:tcPr>
-            <w:tcW w:w="3500" w:type="dxa"/>
+            <w:tcW w:w="2578" w:type="dxa"/>
             <w:tcBorders>
               <w:top w:val="single" w:sz="1" w:space="0" w:color="CCCCCC"/>
               <w:left w:val="single" w:sz="1" w:space="0" w:color="CCCCCC"/>
@@ -18141,7 +17023,7 @@
         </w:tc>
         <w:tc>
           <w:tcPr>
-            <w:tcW w:w="1400" w:type="dxa"/>
+            <w:tcW w:w="1309" w:type="dxa"/>
             <w:tcBorders>
               <w:top w:val="single" w:sz="1" w:space="0" w:color="CCCCCC"/>
               <w:left w:val="single" w:sz="1" w:space="0" w:color="CCCCCC"/>
@@ -18169,7 +17051,7 @@
         </w:tc>
         <w:tc>
           <w:tcPr>
-            <w:tcW w:w="1160" w:type="dxa"/>
+            <w:tcW w:w="1106" w:type="dxa"/>
             <w:tcBorders>
               <w:top w:val="single" w:sz="1" w:space="0" w:color="CCCCCC"/>
               <w:left w:val="single" w:sz="1" w:space="0" w:color="CCCCCC"/>
@@ -18199,7 +17081,7 @@
         </w:tc>
         <w:tc>
           <w:tcPr>
-            <w:tcW w:w="1200" w:type="dxa"/>
+            <w:tcW w:w="1146" w:type="dxa"/>
             <w:tcBorders>
               <w:top w:val="single" w:sz="1" w:space="0" w:color="CCCCCC"/>
               <w:left w:val="single" w:sz="1" w:space="0" w:color="CCCCCC"/>
@@ -18227,7 +17109,7 @@
         </w:tc>
         <w:tc>
           <w:tcPr>
-            <w:tcW w:w="1200" w:type="dxa"/>
+            <w:tcW w:w="1420" w:type="dxa"/>
             <w:tcBorders>
               <w:top w:val="single" w:sz="1" w:space="0" w:color="CCCCCC"/>
               <w:left w:val="single" w:sz="1" w:space="0" w:color="CCCCCC"/>
@@ -18257,7 +17139,7 @@
         </w:tc>
         <w:tc>
           <w:tcPr>
-            <w:tcW w:w="1000" w:type="dxa"/>
+            <w:tcW w:w="1770" w:type="dxa"/>
             <w:tcBorders>
               <w:top w:val="single" w:sz="1" w:space="0" w:color="CCCCCC"/>
               <w:left w:val="single" w:sz="1" w:space="0" w:color="CCCCCC"/>
@@ -18285,15 +17167,9 @@
         </w:tc>
       </w:tr>
       <w:tr>
-        <w:tblPrEx>
-          <w:tblCellMar>
-            <w:top w:w="0" w:type="dxa"/>
-            <w:bottom w:w="0" w:type="dxa"/>
-          </w:tblCellMar>
-        </w:tblPrEx>
-        <w:tc>
-          <w:tcPr>
-            <w:tcW w:w="900" w:type="dxa"/>
+        <w:tc>
+          <w:tcPr>
+            <w:tcW w:w="750" w:type="dxa"/>
             <w:tcBorders>
               <w:top w:val="single" w:sz="1" w:space="0" w:color="CCCCCC"/>
               <w:left w:val="single" w:sz="1" w:space="0" w:color="CCCCCC"/>
@@ -18321,7 +17197,7 @@
         </w:tc>
         <w:tc>
           <w:tcPr>
-            <w:tcW w:w="3500" w:type="dxa"/>
+            <w:tcW w:w="2578" w:type="dxa"/>
             <w:tcBorders>
               <w:top w:val="single" w:sz="1" w:space="0" w:color="CCCCCC"/>
               <w:left w:val="single" w:sz="1" w:space="0" w:color="CCCCCC"/>
@@ -18349,7 +17225,7 @@
         </w:tc>
         <w:tc>
           <w:tcPr>
-            <w:tcW w:w="1400" w:type="dxa"/>
+            <w:tcW w:w="1309" w:type="dxa"/>
             <w:tcBorders>
               <w:top w:val="single" w:sz="1" w:space="0" w:color="CCCCCC"/>
               <w:left w:val="single" w:sz="1" w:space="0" w:color="CCCCCC"/>
@@ -18377,7 +17253,7 @@
         </w:tc>
         <w:tc>
           <w:tcPr>
-            <w:tcW w:w="1160" w:type="dxa"/>
+            <w:tcW w:w="1106" w:type="dxa"/>
             <w:tcBorders>
               <w:top w:val="single" w:sz="1" w:space="0" w:color="CCCCCC"/>
               <w:left w:val="single" w:sz="1" w:space="0" w:color="CCCCCC"/>
@@ -18407,7 +17283,7 @@
         </w:tc>
         <w:tc>
           <w:tcPr>
-            <w:tcW w:w="1200" w:type="dxa"/>
+            <w:tcW w:w="1146" w:type="dxa"/>
             <w:tcBorders>
               <w:top w:val="single" w:sz="1" w:space="0" w:color="CCCCCC"/>
               <w:left w:val="single" w:sz="1" w:space="0" w:color="CCCCCC"/>
@@ -18435,7 +17311,7 @@
         </w:tc>
         <w:tc>
           <w:tcPr>
-            <w:tcW w:w="1200" w:type="dxa"/>
+            <w:tcW w:w="1420" w:type="dxa"/>
             <w:tcBorders>
               <w:top w:val="single" w:sz="1" w:space="0" w:color="CCCCCC"/>
               <w:left w:val="single" w:sz="1" w:space="0" w:color="CCCCCC"/>
@@ -18465,7 +17341,7 @@
         </w:tc>
         <w:tc>
           <w:tcPr>
-            <w:tcW w:w="1000" w:type="dxa"/>
+            <w:tcW w:w="1770" w:type="dxa"/>
             <w:tcBorders>
               <w:top w:val="single" w:sz="1" w:space="0" w:color="CCCCCC"/>
               <w:left w:val="single" w:sz="1" w:space="0" w:color="CCCCCC"/>
@@ -18493,15 +17369,9 @@
         </w:tc>
       </w:tr>
       <w:tr>
-        <w:tblPrEx>
-          <w:tblCellMar>
-            <w:top w:w="0" w:type="dxa"/>
-            <w:bottom w:w="0" w:type="dxa"/>
-          </w:tblCellMar>
-        </w:tblPrEx>
-        <w:tc>
-          <w:tcPr>
-            <w:tcW w:w="900" w:type="dxa"/>
+        <w:tc>
+          <w:tcPr>
+            <w:tcW w:w="750" w:type="dxa"/>
             <w:tcBorders>
               <w:top w:val="single" w:sz="1" w:space="0" w:color="CCCCCC"/>
               <w:left w:val="single" w:sz="1" w:space="0" w:color="CCCCCC"/>
@@ -18529,7 +17399,7 @@
         </w:tc>
         <w:tc>
           <w:tcPr>
-            <w:tcW w:w="3500" w:type="dxa"/>
+            <w:tcW w:w="2578" w:type="dxa"/>
             <w:tcBorders>
               <w:top w:val="single" w:sz="1" w:space="0" w:color="CCCCCC"/>
               <w:left w:val="single" w:sz="1" w:space="0" w:color="CCCCCC"/>
@@ -18557,7 +17427,7 @@
         </w:tc>
         <w:tc>
           <w:tcPr>
-            <w:tcW w:w="1400" w:type="dxa"/>
+            <w:tcW w:w="1309" w:type="dxa"/>
             <w:tcBorders>
               <w:top w:val="single" w:sz="1" w:space="0" w:color="CCCCCC"/>
               <w:left w:val="single" w:sz="1" w:space="0" w:color="CCCCCC"/>
@@ -18585,7 +17455,7 @@
         </w:tc>
         <w:tc>
           <w:tcPr>
-            <w:tcW w:w="1160" w:type="dxa"/>
+            <w:tcW w:w="1106" w:type="dxa"/>
             <w:tcBorders>
               <w:top w:val="single" w:sz="1" w:space="0" w:color="CCCCCC"/>
               <w:left w:val="single" w:sz="1" w:space="0" w:color="CCCCCC"/>
@@ -18613,7 +17483,7 @@
         </w:tc>
         <w:tc>
           <w:tcPr>
-            <w:tcW w:w="1200" w:type="dxa"/>
+            <w:tcW w:w="1146" w:type="dxa"/>
             <w:tcBorders>
               <w:top w:val="single" w:sz="1" w:space="0" w:color="CCCCCC"/>
               <w:left w:val="single" w:sz="1" w:space="0" w:color="CCCCCC"/>
@@ -18641,7 +17511,7 @@
         </w:tc>
         <w:tc>
           <w:tcPr>
-            <w:tcW w:w="1200" w:type="dxa"/>
+            <w:tcW w:w="1420" w:type="dxa"/>
             <w:tcBorders>
               <w:top w:val="single" w:sz="1" w:space="0" w:color="CCCCCC"/>
               <w:left w:val="single" w:sz="1" w:space="0" w:color="CCCCCC"/>
@@ -18671,7 +17541,7 @@
         </w:tc>
         <w:tc>
           <w:tcPr>
-            <w:tcW w:w="1000" w:type="dxa"/>
+            <w:tcW w:w="1770" w:type="dxa"/>
             <w:tcBorders>
               <w:top w:val="single" w:sz="1" w:space="0" w:color="CCCCCC"/>
               <w:left w:val="single" w:sz="1" w:space="0" w:color="CCCCCC"/>
@@ -18699,15 +17569,9 @@
         </w:tc>
       </w:tr>
       <w:tr>
-        <w:tblPrEx>
-          <w:tblCellMar>
-            <w:top w:w="0" w:type="dxa"/>
-            <w:bottom w:w="0" w:type="dxa"/>
-          </w:tblCellMar>
-        </w:tblPrEx>
-        <w:tc>
-          <w:tcPr>
-            <w:tcW w:w="900" w:type="dxa"/>
+        <w:tc>
+          <w:tcPr>
+            <w:tcW w:w="750" w:type="dxa"/>
             <w:tcBorders>
               <w:top w:val="single" w:sz="1" w:space="0" w:color="CCCCCC"/>
               <w:left w:val="single" w:sz="1" w:space="0" w:color="CCCCCC"/>
@@ -18735,7 +17599,7 @@
         </w:tc>
         <w:tc>
           <w:tcPr>
-            <w:tcW w:w="3500" w:type="dxa"/>
+            <w:tcW w:w="2578" w:type="dxa"/>
             <w:tcBorders>
               <w:top w:val="single" w:sz="1" w:space="0" w:color="CCCCCC"/>
               <w:left w:val="single" w:sz="1" w:space="0" w:color="CCCCCC"/>
@@ -18773,7 +17637,7 @@
         </w:tc>
         <w:tc>
           <w:tcPr>
-            <w:tcW w:w="1400" w:type="dxa"/>
+            <w:tcW w:w="1309" w:type="dxa"/>
             <w:tcBorders>
               <w:top w:val="single" w:sz="1" w:space="0" w:color="CCCCCC"/>
               <w:left w:val="single" w:sz="1" w:space="0" w:color="CCCCCC"/>
@@ -18801,7 +17665,7 @@
         </w:tc>
         <w:tc>
           <w:tcPr>
-            <w:tcW w:w="1160" w:type="dxa"/>
+            <w:tcW w:w="1106" w:type="dxa"/>
             <w:tcBorders>
               <w:top w:val="single" w:sz="1" w:space="0" w:color="CCCCCC"/>
               <w:left w:val="single" w:sz="1" w:space="0" w:color="CCCCCC"/>
@@ -18831,7 +17695,7 @@
         </w:tc>
         <w:tc>
           <w:tcPr>
-            <w:tcW w:w="1200" w:type="dxa"/>
+            <w:tcW w:w="1146" w:type="dxa"/>
             <w:tcBorders>
               <w:top w:val="single" w:sz="1" w:space="0" w:color="CCCCCC"/>
               <w:left w:val="single" w:sz="1" w:space="0" w:color="CCCCCC"/>
@@ -18859,7 +17723,7 @@
         </w:tc>
         <w:tc>
           <w:tcPr>
-            <w:tcW w:w="1200" w:type="dxa"/>
+            <w:tcW w:w="1420" w:type="dxa"/>
             <w:tcBorders>
               <w:top w:val="single" w:sz="1" w:space="0" w:color="CCCCCC"/>
               <w:left w:val="single" w:sz="1" w:space="0" w:color="CCCCCC"/>
@@ -18889,7 +17753,7 @@
         </w:tc>
         <w:tc>
           <w:tcPr>
-            <w:tcW w:w="1000" w:type="dxa"/>
+            <w:tcW w:w="1770" w:type="dxa"/>
             <w:tcBorders>
               <w:top w:val="single" w:sz="1" w:space="0" w:color="CCCCCC"/>
               <w:left w:val="single" w:sz="1" w:space="0" w:color="CCCCCC"/>
@@ -18917,15 +17781,9 @@
         </w:tc>
       </w:tr>
       <w:tr>
-        <w:tblPrEx>
-          <w:tblCellMar>
-            <w:top w:w="0" w:type="dxa"/>
-            <w:bottom w:w="0" w:type="dxa"/>
-          </w:tblCellMar>
-        </w:tblPrEx>
-        <w:tc>
-          <w:tcPr>
-            <w:tcW w:w="900" w:type="dxa"/>
+        <w:tc>
+          <w:tcPr>
+            <w:tcW w:w="750" w:type="dxa"/>
             <w:tcBorders>
               <w:top w:val="single" w:sz="1" w:space="0" w:color="CCCCCC"/>
               <w:left w:val="single" w:sz="1" w:space="0" w:color="CCCCCC"/>
@@ -18953,7 +17811,7 @@
         </w:tc>
         <w:tc>
           <w:tcPr>
-            <w:tcW w:w="3500" w:type="dxa"/>
+            <w:tcW w:w="2578" w:type="dxa"/>
             <w:tcBorders>
               <w:top w:val="single" w:sz="1" w:space="0" w:color="CCCCCC"/>
               <w:left w:val="single" w:sz="1" w:space="0" w:color="CCCCCC"/>
@@ -18981,7 +17839,7 @@
         </w:tc>
         <w:tc>
           <w:tcPr>
-            <w:tcW w:w="1400" w:type="dxa"/>
+            <w:tcW w:w="1309" w:type="dxa"/>
             <w:tcBorders>
               <w:top w:val="single" w:sz="1" w:space="0" w:color="CCCCCC"/>
               <w:left w:val="single" w:sz="1" w:space="0" w:color="CCCCCC"/>
@@ -19009,7 +17867,7 @@
         </w:tc>
         <w:tc>
           <w:tcPr>
-            <w:tcW w:w="1160" w:type="dxa"/>
+            <w:tcW w:w="1106" w:type="dxa"/>
             <w:tcBorders>
               <w:top w:val="single" w:sz="1" w:space="0" w:color="CCCCCC"/>
               <w:left w:val="single" w:sz="1" w:space="0" w:color="CCCCCC"/>
@@ -19039,7 +17897,7 @@
         </w:tc>
         <w:tc>
           <w:tcPr>
-            <w:tcW w:w="1200" w:type="dxa"/>
+            <w:tcW w:w="1146" w:type="dxa"/>
             <w:tcBorders>
               <w:top w:val="single" w:sz="1" w:space="0" w:color="CCCCCC"/>
               <w:left w:val="single" w:sz="1" w:space="0" w:color="CCCCCC"/>
@@ -19067,7 +17925,7 @@
         </w:tc>
         <w:tc>
           <w:tcPr>
-            <w:tcW w:w="1200" w:type="dxa"/>
+            <w:tcW w:w="1420" w:type="dxa"/>
             <w:tcBorders>
               <w:top w:val="single" w:sz="1" w:space="0" w:color="CCCCCC"/>
               <w:left w:val="single" w:sz="1" w:space="0" w:color="CCCCCC"/>
@@ -19097,7 +17955,7 @@
         </w:tc>
         <w:tc>
           <w:tcPr>
-            <w:tcW w:w="1000" w:type="dxa"/>
+            <w:tcW w:w="1770" w:type="dxa"/>
             <w:tcBorders>
               <w:top w:val="single" w:sz="1" w:space="0" w:color="CCCCCC"/>
               <w:left w:val="single" w:sz="1" w:space="0" w:color="CCCCCC"/>
@@ -19125,15 +17983,9 @@
         </w:tc>
       </w:tr>
       <w:tr>
-        <w:tblPrEx>
-          <w:tblCellMar>
-            <w:top w:w="0" w:type="dxa"/>
-            <w:bottom w:w="0" w:type="dxa"/>
-          </w:tblCellMar>
-        </w:tblPrEx>
-        <w:tc>
-          <w:tcPr>
-            <w:tcW w:w="900" w:type="dxa"/>
+        <w:tc>
+          <w:tcPr>
+            <w:tcW w:w="750" w:type="dxa"/>
             <w:tcBorders>
               <w:top w:val="single" w:sz="1" w:space="0" w:color="CCCCCC"/>
               <w:left w:val="single" w:sz="1" w:space="0" w:color="CCCCCC"/>
@@ -19161,7 +18013,7 @@
         </w:tc>
         <w:tc>
           <w:tcPr>
-            <w:tcW w:w="3500" w:type="dxa"/>
+            <w:tcW w:w="2578" w:type="dxa"/>
             <w:tcBorders>
               <w:top w:val="single" w:sz="1" w:space="0" w:color="CCCCCC"/>
               <w:left w:val="single" w:sz="1" w:space="0" w:color="CCCCCC"/>
@@ -19189,7 +18041,7 @@
         </w:tc>
         <w:tc>
           <w:tcPr>
-            <w:tcW w:w="1400" w:type="dxa"/>
+            <w:tcW w:w="1309" w:type="dxa"/>
             <w:tcBorders>
               <w:top w:val="single" w:sz="1" w:space="0" w:color="CCCCCC"/>
               <w:left w:val="single" w:sz="1" w:space="0" w:color="CCCCCC"/>
@@ -19217,7 +18069,7 @@
         </w:tc>
         <w:tc>
           <w:tcPr>
-            <w:tcW w:w="1160" w:type="dxa"/>
+            <w:tcW w:w="1106" w:type="dxa"/>
             <w:tcBorders>
               <w:top w:val="single" w:sz="1" w:space="0" w:color="CCCCCC"/>
               <w:left w:val="single" w:sz="1" w:space="0" w:color="CCCCCC"/>
@@ -19247,7 +18099,7 @@
         </w:tc>
         <w:tc>
           <w:tcPr>
-            <w:tcW w:w="1200" w:type="dxa"/>
+            <w:tcW w:w="1146" w:type="dxa"/>
             <w:tcBorders>
               <w:top w:val="single" w:sz="1" w:space="0" w:color="CCCCCC"/>
               <w:left w:val="single" w:sz="1" w:space="0" w:color="CCCCCC"/>
@@ -19275,7 +18127,7 @@
         </w:tc>
         <w:tc>
           <w:tcPr>
-            <w:tcW w:w="1200" w:type="dxa"/>
+            <w:tcW w:w="1420" w:type="dxa"/>
             <w:tcBorders>
               <w:top w:val="single" w:sz="1" w:space="0" w:color="CCCCCC"/>
               <w:left w:val="single" w:sz="1" w:space="0" w:color="CCCCCC"/>
@@ -19305,7 +18157,7 @@
         </w:tc>
         <w:tc>
           <w:tcPr>
-            <w:tcW w:w="1000" w:type="dxa"/>
+            <w:tcW w:w="1770" w:type="dxa"/>
             <w:tcBorders>
               <w:top w:val="single" w:sz="1" w:space="0" w:color="CCCCCC"/>
               <w:left w:val="single" w:sz="1" w:space="0" w:color="CCCCCC"/>
@@ -19333,15 +18185,9 @@
         </w:tc>
       </w:tr>
       <w:tr>
-        <w:tblPrEx>
-          <w:tblCellMar>
-            <w:top w:w="0" w:type="dxa"/>
-            <w:bottom w:w="0" w:type="dxa"/>
-          </w:tblCellMar>
-        </w:tblPrEx>
-        <w:tc>
-          <w:tcPr>
-            <w:tcW w:w="900" w:type="dxa"/>
+        <w:tc>
+          <w:tcPr>
+            <w:tcW w:w="750" w:type="dxa"/>
             <w:tcBorders>
               <w:top w:val="single" w:sz="1" w:space="0" w:color="CCCCCC"/>
               <w:left w:val="single" w:sz="1" w:space="0" w:color="CCCCCC"/>
@@ -19369,7 +18215,7 @@
         </w:tc>
         <w:tc>
           <w:tcPr>
-            <w:tcW w:w="3500" w:type="dxa"/>
+            <w:tcW w:w="2578" w:type="dxa"/>
             <w:tcBorders>
               <w:top w:val="single" w:sz="1" w:space="0" w:color="CCCCCC"/>
               <w:left w:val="single" w:sz="1" w:space="0" w:color="CCCCCC"/>
@@ -19425,7 +18271,7 @@
         </w:tc>
         <w:tc>
           <w:tcPr>
-            <w:tcW w:w="1400" w:type="dxa"/>
+            <w:tcW w:w="1309" w:type="dxa"/>
             <w:tcBorders>
               <w:top w:val="single" w:sz="1" w:space="0" w:color="CCCCCC"/>
               <w:left w:val="single" w:sz="1" w:space="0" w:color="CCCCCC"/>
@@ -19453,7 +18299,7 @@
         </w:tc>
         <w:tc>
           <w:tcPr>
-            <w:tcW w:w="1160" w:type="dxa"/>
+            <w:tcW w:w="1106" w:type="dxa"/>
             <w:tcBorders>
               <w:top w:val="single" w:sz="1" w:space="0" w:color="CCCCCC"/>
               <w:left w:val="single" w:sz="1" w:space="0" w:color="CCCCCC"/>
@@ -19483,7 +18329,7 @@
         </w:tc>
         <w:tc>
           <w:tcPr>
-            <w:tcW w:w="1200" w:type="dxa"/>
+            <w:tcW w:w="1146" w:type="dxa"/>
             <w:tcBorders>
               <w:top w:val="single" w:sz="1" w:space="0" w:color="CCCCCC"/>
               <w:left w:val="single" w:sz="1" w:space="0" w:color="CCCCCC"/>
@@ -19529,7 +18375,7 @@
         </w:tc>
         <w:tc>
           <w:tcPr>
-            <w:tcW w:w="1200" w:type="dxa"/>
+            <w:tcW w:w="1420" w:type="dxa"/>
             <w:tcBorders>
               <w:top w:val="single" w:sz="1" w:space="0" w:color="CCCCCC"/>
               <w:left w:val="single" w:sz="1" w:space="0" w:color="CCCCCC"/>
@@ -19559,7 +18405,7 @@
         </w:tc>
         <w:tc>
           <w:tcPr>
-            <w:tcW w:w="1000" w:type="dxa"/>
+            <w:tcW w:w="1770" w:type="dxa"/>
             <w:tcBorders>
               <w:top w:val="single" w:sz="1" w:space="0" w:color="CCCCCC"/>
               <w:left w:val="single" w:sz="1" w:space="0" w:color="CCCCCC"/>
@@ -19587,15 +18433,9 @@
         </w:tc>
       </w:tr>
       <w:tr>
-        <w:tblPrEx>
-          <w:tblCellMar>
-            <w:top w:w="0" w:type="dxa"/>
-            <w:bottom w:w="0" w:type="dxa"/>
-          </w:tblCellMar>
-        </w:tblPrEx>
-        <w:tc>
-          <w:tcPr>
-            <w:tcW w:w="900" w:type="dxa"/>
+        <w:tc>
+          <w:tcPr>
+            <w:tcW w:w="750" w:type="dxa"/>
             <w:tcBorders>
               <w:top w:val="single" w:sz="1" w:space="0" w:color="CCCCCC"/>
               <w:left w:val="single" w:sz="1" w:space="0" w:color="CCCCCC"/>
@@ -19623,7 +18463,7 @@
         </w:tc>
         <w:tc>
           <w:tcPr>
-            <w:tcW w:w="3500" w:type="dxa"/>
+            <w:tcW w:w="2578" w:type="dxa"/>
             <w:tcBorders>
               <w:top w:val="single" w:sz="1" w:space="0" w:color="CCCCCC"/>
               <w:left w:val="single" w:sz="1" w:space="0" w:color="CCCCCC"/>
@@ -19661,7 +18501,7 @@
         </w:tc>
         <w:tc>
           <w:tcPr>
-            <w:tcW w:w="1400" w:type="dxa"/>
+            <w:tcW w:w="1309" w:type="dxa"/>
             <w:tcBorders>
               <w:top w:val="single" w:sz="1" w:space="0" w:color="CCCCCC"/>
               <w:left w:val="single" w:sz="1" w:space="0" w:color="CCCCCC"/>
@@ -19689,7 +18529,7 @@
         </w:tc>
         <w:tc>
           <w:tcPr>
-            <w:tcW w:w="1160" w:type="dxa"/>
+            <w:tcW w:w="1106" w:type="dxa"/>
             <w:tcBorders>
               <w:top w:val="single" w:sz="1" w:space="0" w:color="CCCCCC"/>
               <w:left w:val="single" w:sz="1" w:space="0" w:color="CCCCCC"/>
@@ -19719,7 +18559,7 @@
         </w:tc>
         <w:tc>
           <w:tcPr>
-            <w:tcW w:w="1200" w:type="dxa"/>
+            <w:tcW w:w="1146" w:type="dxa"/>
             <w:tcBorders>
               <w:top w:val="single" w:sz="1" w:space="0" w:color="CCCCCC"/>
               <w:left w:val="single" w:sz="1" w:space="0" w:color="CCCCCC"/>
@@ -19765,7 +18605,7 @@
         </w:tc>
         <w:tc>
           <w:tcPr>
-            <w:tcW w:w="1200" w:type="dxa"/>
+            <w:tcW w:w="1420" w:type="dxa"/>
             <w:tcBorders>
               <w:top w:val="single" w:sz="1" w:space="0" w:color="CCCCCC"/>
               <w:left w:val="single" w:sz="1" w:space="0" w:color="CCCCCC"/>
@@ -19795,7 +18635,7 @@
         </w:tc>
         <w:tc>
           <w:tcPr>
-            <w:tcW w:w="1000" w:type="dxa"/>
+            <w:tcW w:w="1770" w:type="dxa"/>
             <w:tcBorders>
               <w:top w:val="single" w:sz="1" w:space="0" w:color="CCCCCC"/>
               <w:left w:val="single" w:sz="1" w:space="0" w:color="CCCCCC"/>
@@ -19882,12 +18722,6 @@
         <w:gridCol w:w="2500"/>
       </w:tblGrid>
       <w:tr>
-        <w:tblPrEx>
-          <w:tblCellMar>
-            <w:top w:w="0" w:type="dxa"/>
-            <w:bottom w:w="0" w:type="dxa"/>
-          </w:tblCellMar>
-        </w:tblPrEx>
         <w:tc>
           <w:tcPr>
             <w:tcW w:w="1400" w:type="dxa"/>
@@ -20026,12 +18860,6 @@
         </w:tc>
       </w:tr>
       <w:tr>
-        <w:tblPrEx>
-          <w:tblCellMar>
-            <w:top w:w="0" w:type="dxa"/>
-            <w:bottom w:w="0" w:type="dxa"/>
-          </w:tblCellMar>
-        </w:tblPrEx>
         <w:tc>
           <w:tcPr>
             <w:tcW w:w="1400" w:type="dxa"/>
@@ -20170,12 +18998,6 @@
         </w:tc>
       </w:tr>
       <w:tr>
-        <w:tblPrEx>
-          <w:tblCellMar>
-            <w:top w:w="0" w:type="dxa"/>
-            <w:bottom w:w="0" w:type="dxa"/>
-          </w:tblCellMar>
-        </w:tblPrEx>
         <w:tc>
           <w:tcPr>
             <w:tcW w:w="1400" w:type="dxa"/>
@@ -20292,12 +19114,6 @@
         </w:tc>
       </w:tr>
       <w:tr>
-        <w:tblPrEx>
-          <w:tblCellMar>
-            <w:top w:w="0" w:type="dxa"/>
-            <w:bottom w:w="0" w:type="dxa"/>
-          </w:tblCellMar>
-        </w:tblPrEx>
         <w:tc>
           <w:tcPr>
             <w:tcW w:w="1400" w:type="dxa"/>
@@ -20422,12 +19238,6 @@
         </w:tc>
       </w:tr>
       <w:tr>
-        <w:tblPrEx>
-          <w:tblCellMar>
-            <w:top w:w="0" w:type="dxa"/>
-            <w:bottom w:w="0" w:type="dxa"/>
-          </w:tblCellMar>
-        </w:tblPrEx>
         <w:tc>
           <w:tcPr>
             <w:tcW w:w="1400" w:type="dxa"/>
@@ -20613,12 +19423,6 @@
         <w:gridCol w:w="1361"/>
       </w:tblGrid>
       <w:tr>
-        <w:tblPrEx>
-          <w:tblCellMar>
-            <w:top w:w="0" w:type="dxa"/>
-            <w:bottom w:w="0" w:type="dxa"/>
-          </w:tblCellMar>
-        </w:tblPrEx>
         <w:tc>
           <w:tcPr>
             <w:tcW w:w="800" w:type="dxa"/>
@@ -20859,12 +19663,6 @@
         </w:tc>
       </w:tr>
       <w:tr>
-        <w:tblPrEx>
-          <w:tblCellMar>
-            <w:top w:w="0" w:type="dxa"/>
-            <w:bottom w:w="0" w:type="dxa"/>
-          </w:tblCellMar>
-        </w:tblPrEx>
         <w:tc>
           <w:tcPr>
             <w:tcW w:w="800" w:type="dxa"/>
@@ -21009,12 +19807,6 @@
         </w:tc>
       </w:tr>
       <w:tr>
-        <w:tblPrEx>
-          <w:tblCellMar>
-            <w:top w:w="0" w:type="dxa"/>
-            <w:bottom w:w="0" w:type="dxa"/>
-          </w:tblCellMar>
-        </w:tblPrEx>
         <w:tc>
           <w:tcPr>
             <w:tcW w:w="800" w:type="dxa"/>
@@ -21159,12 +19951,6 @@
         </w:tc>
       </w:tr>
       <w:tr>
-        <w:tblPrEx>
-          <w:tblCellMar>
-            <w:top w:w="0" w:type="dxa"/>
-            <w:bottom w:w="0" w:type="dxa"/>
-          </w:tblCellMar>
-        </w:tblPrEx>
         <w:tc>
           <w:tcPr>
             <w:tcW w:w="800" w:type="dxa"/>
@@ -21348,12 +20134,6 @@
         <w:gridCol w:w="3160"/>
       </w:tblGrid>
       <w:tr>
-        <w:tblPrEx>
-          <w:tblCellMar>
-            <w:top w:w="0" w:type="dxa"/>
-            <w:bottom w:w="0" w:type="dxa"/>
-          </w:tblCellMar>
-        </w:tblPrEx>
         <w:tc>
           <w:tcPr>
             <w:tcW w:w="800" w:type="dxa"/>
@@ -21526,12 +20306,6 @@
         </w:tc>
       </w:tr>
       <w:tr>
-        <w:tblPrEx>
-          <w:tblCellMar>
-            <w:top w:w="0" w:type="dxa"/>
-            <w:bottom w:w="0" w:type="dxa"/>
-          </w:tblCellMar>
-        </w:tblPrEx>
         <w:tc>
           <w:tcPr>
             <w:tcW w:w="800" w:type="dxa"/>
@@ -21712,12 +20486,6 @@
         </w:tc>
       </w:tr>
       <w:tr>
-        <w:tblPrEx>
-          <w:tblCellMar>
-            <w:top w:w="0" w:type="dxa"/>
-            <w:bottom w:w="0" w:type="dxa"/>
-          </w:tblCellMar>
-        </w:tblPrEx>
         <w:tc>
           <w:tcPr>
             <w:tcW w:w="800" w:type="dxa"/>
@@ -21862,12 +20630,6 @@
         </w:tc>
       </w:tr>
       <w:tr>
-        <w:tblPrEx>
-          <w:tblCellMar>
-            <w:top w:w="0" w:type="dxa"/>
-            <w:bottom w:w="0" w:type="dxa"/>
-          </w:tblCellMar>
-        </w:tblPrEx>
         <w:tc>
           <w:tcPr>
             <w:tcW w:w="800" w:type="dxa"/>
@@ -22048,12 +20810,6 @@
         </w:tc>
       </w:tr>
       <w:tr>
-        <w:tblPrEx>
-          <w:tblCellMar>
-            <w:top w:w="0" w:type="dxa"/>
-            <w:bottom w:w="0" w:type="dxa"/>
-          </w:tblCellMar>
-        </w:tblPrEx>
         <w:tc>
           <w:tcPr>
             <w:tcW w:w="800" w:type="dxa"/>
@@ -22216,12 +20972,6 @@
         </w:tc>
       </w:tr>
       <w:tr>
-        <w:tblPrEx>
-          <w:tblCellMar>
-            <w:top w:w="0" w:type="dxa"/>
-            <w:bottom w:w="0" w:type="dxa"/>
-          </w:tblCellMar>
-        </w:tblPrEx>
         <w:tc>
           <w:tcPr>
             <w:tcW w:w="800" w:type="dxa"/>
@@ -22418,12 +21168,6 @@
         <w:gridCol w:w="4680"/>
       </w:tblGrid>
       <w:tr>
-        <w:tblPrEx>
-          <w:tblCellMar>
-            <w:top w:w="0" w:type="dxa"/>
-            <w:bottom w:w="0" w:type="dxa"/>
-          </w:tblCellMar>
-        </w:tblPrEx>
         <w:tc>
           <w:tcPr>
             <w:tcW w:w="4680" w:type="dxa"/>
@@ -22676,12 +21420,6 @@
         <w:gridCol w:w="9360"/>
       </w:tblGrid>
       <w:tr>
-        <w:tblPrEx>
-          <w:tblCellMar>
-            <w:top w:w="0" w:type="dxa"/>
-            <w:bottom w:w="0" w:type="dxa"/>
-          </w:tblCellMar>
-        </w:tblPrEx>
         <w:tc>
           <w:tcPr>
             <w:tcW w:w="9360" w:type="dxa"/>
@@ -23477,6 +22215,7 @@
   <w:style w:type="character" w:default="1" w:styleId="Fuentedeprrafopredeter">
     <w:name w:val="Default Paragraph Font"/>
     <w:uiPriority w:val="1"/>
+    <w:semiHidden/>
     <w:unhideWhenUsed/>
   </w:style>
   <w:style w:type="table" w:default="1" w:styleId="Tablanormal">

</xml_diff>